<commit_message>
"Updating how commit is done"
</commit_message>
<xml_diff>
--- a/scripts/update_repos/script_to_update_all_repos.docx
+++ b/scripts/update_repos/script_to_update_all_repos.docx
@@ -26,6 +26,9 @@
     </w:p>
     <w:p>
       <w:r>
+        <w:rPr>
+          <w:noProof/>
+        </w:rPr>
         <w:drawing>
           <wp:inline distT="0" distB="0" distL="0" distR="0" wp14:anchorId="33CFA2CD" wp14:editId="2AECE2E0">
             <wp:extent cx="5943600" cy="3084830"/>
@@ -3795,10 +3798,7 @@
         </w:numPr>
       </w:pPr>
       <w:r>
-        <w:t>Create a .bat wrapper</w:t>
-      </w:r>
-      <w:r>
-        <w:t>:</w:t>
+        <w:t>Create a .bat wrapper:</w:t>
       </w:r>
     </w:p>
     <w:p>
@@ -5142,6 +5142,7 @@
         <w:rPr>
           <w:rStyle w:val="Code-Consolas"/>
           <w:rFonts w:asciiTheme="minorHAnsi" w:hAnsiTheme="minorHAnsi" w:cstheme="minorHAnsi"/>
+          <w:noProof/>
         </w:rPr>
         <w:drawing>
           <wp:inline distT="0" distB="0" distL="0" distR="0" wp14:anchorId="1F67A078" wp14:editId="14BE1C44">
@@ -5615,6 +5616,7 @@
         <w:rPr>
           <w:rStyle w:val="Code-Consolas"/>
           <w:rFonts w:asciiTheme="minorHAnsi" w:hAnsiTheme="minorHAnsi" w:cstheme="minorHAnsi"/>
+          <w:noProof/>
         </w:rPr>
         <w:drawing>
           <wp:inline distT="0" distB="0" distL="0" distR="0" wp14:anchorId="227F076A" wp14:editId="06A0788C">
@@ -6571,6 +6573,233 @@
     </w:p>
     <w:p>
       <w:pPr>
+        <w:pStyle w:val="Heading1"/>
+        <w:rPr>
+          <w:rStyle w:val="Code-Consolas"/>
+          <w:rFonts w:asciiTheme="minorHAnsi" w:hAnsiTheme="minorHAnsi" w:cstheme="minorHAnsi"/>
+        </w:rPr>
+      </w:pPr>
+      <w:r>
+        <w:rPr>
+          <w:rStyle w:val="Code-Consolas"/>
+          <w:rFonts w:asciiTheme="minorHAnsi" w:hAnsiTheme="minorHAnsi" w:cstheme="minorHAnsi"/>
+        </w:rPr>
+        <w:t>Issues</w:t>
+      </w:r>
+    </w:p>
+    <w:p>
+      <w:r>
+        <w:t>Issue #1: The script did not update GitHub.</w:t>
+      </w:r>
+    </w:p>
+    <w:p>
+      <w:r>
+        <w:t>The reason was found to be associated with the fact that I usually enter my commit message with a starting and ending quote, e.g. “This is a test”.</w:t>
+      </w:r>
+    </w:p>
+    <w:p>
+      <w:r>
+        <w:t>The problem is that this breaks the commit part because the code uses:</w:t>
+      </w:r>
+    </w:p>
+    <w:p>
+      <w:pPr>
+        <w:shd w:val="clear" w:color="auto" w:fill="131314"/>
+        <w:tabs>
+          <w:tab w:val="left" w:pos="916"/>
+          <w:tab w:val="left" w:pos="1832"/>
+          <w:tab w:val="left" w:pos="2748"/>
+          <w:tab w:val="left" w:pos="3664"/>
+          <w:tab w:val="left" w:pos="4580"/>
+          <w:tab w:val="left" w:pos="5496"/>
+          <w:tab w:val="left" w:pos="6412"/>
+          <w:tab w:val="left" w:pos="7328"/>
+          <w:tab w:val="left" w:pos="8244"/>
+          <w:tab w:val="left" w:pos="9160"/>
+          <w:tab w:val="left" w:pos="10076"/>
+          <w:tab w:val="left" w:pos="10992"/>
+          <w:tab w:val="left" w:pos="11908"/>
+          <w:tab w:val="left" w:pos="12824"/>
+          <w:tab w:val="left" w:pos="13740"/>
+          <w:tab w:val="left" w:pos="14656"/>
+        </w:tabs>
+        <w:spacing w:after="0" w:line="240" w:lineRule="auto"/>
+        <w:rPr>
+          <w:rFonts w:ascii="Courier New" w:eastAsia="Times New Roman" w:hAnsi="Courier New" w:cs="Courier New"/>
+          <w:color w:val="EBEBEB"/>
+          <w:kern w:val="0"/>
+          <w:sz w:val="33"/>
+          <w:szCs w:val="33"/>
+          <w14:ligatures w14:val="none"/>
+        </w:rPr>
+      </w:pPr>
+      <w:proofErr w:type="gramStart"/>
+      <w:r>
+        <w:rPr>
+          <w:rFonts w:ascii="Courier New" w:eastAsia="Times New Roman" w:hAnsi="Courier New" w:cs="Courier New"/>
+          <w:color w:val="EBEBEB"/>
+          <w:kern w:val="0"/>
+          <w:sz w:val="33"/>
+          <w:szCs w:val="33"/>
+          <w14:ligatures w14:val="none"/>
+        </w:rPr>
+        <w:t>run(</w:t>
+      </w:r>
+      <w:proofErr w:type="spellStart"/>
+      <w:proofErr w:type="gramEnd"/>
+      <w:r>
+        <w:rPr>
+          <w:rFonts w:ascii="Courier New" w:eastAsia="Times New Roman" w:hAnsi="Courier New" w:cs="Courier New"/>
+          <w:color w:val="54B33E"/>
+          <w:kern w:val="0"/>
+          <w:sz w:val="33"/>
+          <w:szCs w:val="33"/>
+          <w14:ligatures w14:val="none"/>
+        </w:rPr>
+        <w:t>f'git</w:t>
+      </w:r>
+      <w:proofErr w:type="spellEnd"/>
+      <w:r>
+        <w:rPr>
+          <w:rFonts w:ascii="Courier New" w:eastAsia="Times New Roman" w:hAnsi="Courier New" w:cs="Courier New"/>
+          <w:color w:val="54B33E"/>
+          <w:kern w:val="0"/>
+          <w:sz w:val="33"/>
+          <w:szCs w:val="33"/>
+          <w14:ligatures w14:val="none"/>
+        </w:rPr>
+        <w:t xml:space="preserve"> commit -</w:t>
+      </w:r>
+      <w:proofErr w:type="gramStart"/>
+      <w:r>
+        <w:rPr>
+          <w:rFonts w:ascii="Courier New" w:eastAsia="Times New Roman" w:hAnsi="Courier New" w:cs="Courier New"/>
+          <w:color w:val="54B33E"/>
+          <w:kern w:val="0"/>
+          <w:sz w:val="33"/>
+          <w:szCs w:val="33"/>
+          <w14:ligatures w14:val="none"/>
+        </w:rPr>
+        <w:t>m "</w:t>
+      </w:r>
+      <w:r>
+        <w:rPr>
+          <w:rFonts w:ascii="Courier New" w:eastAsia="Times New Roman" w:hAnsi="Courier New" w:cs="Courier New"/>
+          <w:color w:val="ED864A"/>
+          <w:kern w:val="0"/>
+          <w:sz w:val="33"/>
+          <w:szCs w:val="33"/>
+          <w14:ligatures w14:val="none"/>
+        </w:rPr>
+        <w:t>{</w:t>
+      </w:r>
+      <w:r>
+        <w:rPr>
+          <w:rFonts w:ascii="Courier New" w:eastAsia="Times New Roman" w:hAnsi="Courier New" w:cs="Courier New"/>
+          <w:color w:val="EBEBEB"/>
+          <w:kern w:val="0"/>
+          <w:sz w:val="33"/>
+          <w:szCs w:val="33"/>
+          <w14:ligatures w14:val="none"/>
+        </w:rPr>
+        <w:t>msg</w:t>
+      </w:r>
+      <w:r>
+        <w:rPr>
+          <w:rFonts w:ascii="Courier New" w:eastAsia="Times New Roman" w:hAnsi="Courier New" w:cs="Courier New"/>
+          <w:color w:val="ED864A"/>
+          <w:kern w:val="0"/>
+          <w:sz w:val="33"/>
+          <w:szCs w:val="33"/>
+          <w14:ligatures w14:val="none"/>
+        </w:rPr>
+        <w:t>}</w:t>
+      </w:r>
+      <w:r>
+        <w:rPr>
+          <w:rFonts w:ascii="Courier New" w:eastAsia="Times New Roman" w:hAnsi="Courier New" w:cs="Courier New"/>
+          <w:color w:val="54B33E"/>
+          <w:kern w:val="0"/>
+          <w:sz w:val="33"/>
+          <w:szCs w:val="33"/>
+          <w14:ligatures w14:val="none"/>
+        </w:rPr>
+        <w:t>"</w:t>
+      </w:r>
+      <w:proofErr w:type="gramEnd"/>
+      <w:r>
+        <w:rPr>
+          <w:rFonts w:ascii="Courier New" w:eastAsia="Times New Roman" w:hAnsi="Courier New" w:cs="Courier New"/>
+          <w:color w:val="54B33E"/>
+          <w:kern w:val="0"/>
+          <w:sz w:val="33"/>
+          <w:szCs w:val="33"/>
+          <w14:ligatures w14:val="none"/>
+        </w:rPr>
+        <w:t>'</w:t>
+      </w:r>
+      <w:r>
+        <w:rPr>
+          <w:rFonts w:ascii="Courier New" w:eastAsia="Times New Roman" w:hAnsi="Courier New" w:cs="Courier New"/>
+          <w:b/>
+          <w:bCs/>
+          <w:color w:val="ED864A"/>
+          <w:kern w:val="0"/>
+          <w:sz w:val="33"/>
+          <w:szCs w:val="33"/>
+          <w14:ligatures w14:val="none"/>
+        </w:rPr>
+        <w:t xml:space="preserve">, </w:t>
+      </w:r>
+      <w:r>
+        <w:rPr>
+          <w:rFonts w:ascii="Courier New" w:eastAsia="Times New Roman" w:hAnsi="Courier New" w:cs="Courier New"/>
+          <w:color w:val="FFFFFF"/>
+          <w:kern w:val="0"/>
+          <w:sz w:val="33"/>
+          <w:szCs w:val="33"/>
+          <w14:ligatures w14:val="none"/>
+        </w:rPr>
+        <w:t>path</w:t>
+      </w:r>
+      <w:r>
+        <w:rPr>
+          <w:rFonts w:ascii="Courier New" w:eastAsia="Times New Roman" w:hAnsi="Courier New" w:cs="Courier New"/>
+          <w:color w:val="EBEBEB"/>
+          <w:kern w:val="0"/>
+          <w:sz w:val="33"/>
+          <w:szCs w:val="33"/>
+          <w14:ligatures w14:val="none"/>
+        </w:rPr>
+        <w:t>)</w:t>
+      </w:r>
+    </w:p>
+    <w:p/>
+    <w:p>
+      <w:r>
+        <w:t xml:space="preserve">The above get translated into git commit -m </w:t>
+      </w:r>
+      <w:proofErr w:type="gramStart"/>
+      <w:r>
+        <w:t>“”This</w:t>
+      </w:r>
+      <w:proofErr w:type="gramEnd"/>
+      <w:r>
+        <w:t xml:space="preserve"> is a test”” which generates an error when trying to commit and then fails to execute the push.</w:t>
+      </w:r>
+    </w:p>
+    <w:p>
+      <w:r>
+        <w:t xml:space="preserve">Solution: </w:t>
+      </w:r>
+    </w:p>
+    <w:p>
+      <w:r>
+        <w:t>Change to:</w:t>
+      </w:r>
+    </w:p>
+    <w:p>
+      <w:pPr>
         <w:pStyle w:val="NormalWeb"/>
         <w:pBdr>
           <w:top w:val="single" w:sz="6" w:space="2" w:color="888888"/>
@@ -6597,7 +6826,7 @@
           <w:tab w:val="left" w:pos="14656"/>
         </w:tabs>
         <w:spacing w:before="0" w:beforeAutospacing="0" w:after="0" w:afterAutospacing="0"/>
-        <w:divId w:val="1528635016"/>
+        <w:divId w:val="2081975439"/>
         <w:rPr>
           <w:rFonts w:ascii="Consolas" w:hAnsi="Consolas" w:cs="Courier New"/>
           <w:sz w:val="17"/>
@@ -6612,6 +6841,8 @@
         </w:rPr>
         <w:t xml:space="preserve">1. </w:t>
       </w:r>
+      <w:proofErr w:type="spellStart"/>
+      <w:proofErr w:type="gramStart"/>
       <w:r>
         <w:rPr>
           <w:rFonts w:ascii="Consolas" w:hAnsi="Consolas" w:cs="Courier New"/>
@@ -6619,32 +6850,183 @@
           <w:sz w:val="17"/>
           <w:szCs w:val="17"/>
         </w:rPr>
-        <w:t> </w:t>
-      </w:r>
-    </w:p>
-    <w:p>
-      <w:pPr>
-        <w:rPr>
-          <w:rStyle w:val="Code-Consolas"/>
-          <w:rFonts w:asciiTheme="minorHAnsi" w:hAnsiTheme="minorHAnsi" w:cstheme="minorHAnsi"/>
-        </w:rPr>
-      </w:pPr>
-    </w:p>
-    <w:p>
-      <w:pPr>
-        <w:rPr>
-          <w:rStyle w:val="Code-Consolas"/>
-          <w:rFonts w:asciiTheme="minorHAnsi" w:hAnsiTheme="minorHAnsi" w:cstheme="minorHAnsi"/>
-        </w:rPr>
-      </w:pPr>
-    </w:p>
-    <w:p>
-      <w:pPr>
-        <w:rPr>
-          <w:rStyle w:val="Code-Consolas"/>
-          <w:rFonts w:asciiTheme="minorHAnsi" w:hAnsiTheme="minorHAnsi" w:cstheme="minorHAnsi"/>
-        </w:rPr>
-      </w:pPr>
+        <w:t>subprocess</w:t>
+      </w:r>
+      <w:r>
+        <w:rPr>
+          <w:rFonts w:ascii="Consolas" w:hAnsi="Consolas" w:cs="Courier New"/>
+          <w:color w:val="666600"/>
+          <w:sz w:val="17"/>
+          <w:szCs w:val="17"/>
+        </w:rPr>
+        <w:t>.</w:t>
+      </w:r>
+      <w:r>
+        <w:rPr>
+          <w:rFonts w:ascii="Consolas" w:hAnsi="Consolas" w:cs="Courier New"/>
+          <w:color w:val="000000"/>
+          <w:sz w:val="17"/>
+          <w:szCs w:val="17"/>
+        </w:rPr>
+        <w:t>run</w:t>
+      </w:r>
+      <w:proofErr w:type="spellEnd"/>
+      <w:r>
+        <w:rPr>
+          <w:rFonts w:ascii="Consolas" w:hAnsi="Consolas" w:cs="Courier New"/>
+          <w:color w:val="666600"/>
+          <w:sz w:val="17"/>
+          <w:szCs w:val="17"/>
+        </w:rPr>
+        <w:t>(</w:t>
+      </w:r>
+      <w:proofErr w:type="gramEnd"/>
+      <w:r>
+        <w:rPr>
+          <w:rFonts w:ascii="Consolas" w:hAnsi="Consolas" w:cs="Courier New"/>
+          <w:color w:val="666600"/>
+          <w:sz w:val="17"/>
+          <w:szCs w:val="17"/>
+        </w:rPr>
+        <w:t>[</w:t>
+      </w:r>
+      <w:r>
+        <w:rPr>
+          <w:rFonts w:ascii="Consolas" w:hAnsi="Consolas" w:cs="Courier New"/>
+          <w:color w:val="008800"/>
+          <w:sz w:val="17"/>
+          <w:szCs w:val="17"/>
+        </w:rPr>
+        <w:t>"git"</w:t>
+      </w:r>
+      <w:r>
+        <w:rPr>
+          <w:rFonts w:ascii="Consolas" w:hAnsi="Consolas" w:cs="Courier New"/>
+          <w:color w:val="666600"/>
+          <w:sz w:val="17"/>
+          <w:szCs w:val="17"/>
+        </w:rPr>
+        <w:t>,</w:t>
+      </w:r>
+      <w:r>
+        <w:rPr>
+          <w:rFonts w:ascii="Consolas" w:hAnsi="Consolas" w:cs="Courier New"/>
+          <w:color w:val="000000"/>
+          <w:sz w:val="17"/>
+          <w:szCs w:val="17"/>
+        </w:rPr>
+        <w:t xml:space="preserve"> </w:t>
+      </w:r>
+      <w:r>
+        <w:rPr>
+          <w:rFonts w:ascii="Consolas" w:hAnsi="Consolas" w:cs="Courier New"/>
+          <w:color w:val="008800"/>
+          <w:sz w:val="17"/>
+          <w:szCs w:val="17"/>
+        </w:rPr>
+        <w:t>"commit"</w:t>
+      </w:r>
+      <w:r>
+        <w:rPr>
+          <w:rFonts w:ascii="Consolas" w:hAnsi="Consolas" w:cs="Courier New"/>
+          <w:color w:val="666600"/>
+          <w:sz w:val="17"/>
+          <w:szCs w:val="17"/>
+        </w:rPr>
+        <w:t>,</w:t>
+      </w:r>
+      <w:r>
+        <w:rPr>
+          <w:rFonts w:ascii="Consolas" w:hAnsi="Consolas" w:cs="Courier New"/>
+          <w:color w:val="000000"/>
+          <w:sz w:val="17"/>
+          <w:szCs w:val="17"/>
+        </w:rPr>
+        <w:t xml:space="preserve"> </w:t>
+      </w:r>
+      <w:r>
+        <w:rPr>
+          <w:rFonts w:ascii="Consolas" w:hAnsi="Consolas" w:cs="Courier New"/>
+          <w:color w:val="008800"/>
+          <w:sz w:val="17"/>
+          <w:szCs w:val="17"/>
+        </w:rPr>
+        <w:t>"-m"</w:t>
+      </w:r>
+      <w:r>
+        <w:rPr>
+          <w:rFonts w:ascii="Consolas" w:hAnsi="Consolas" w:cs="Courier New"/>
+          <w:color w:val="666600"/>
+          <w:sz w:val="17"/>
+          <w:szCs w:val="17"/>
+        </w:rPr>
+        <w:t>,</w:t>
+      </w:r>
+      <w:r>
+        <w:rPr>
+          <w:rFonts w:ascii="Consolas" w:hAnsi="Consolas" w:cs="Courier New"/>
+          <w:color w:val="000000"/>
+          <w:sz w:val="17"/>
+          <w:szCs w:val="17"/>
+        </w:rPr>
+        <w:t xml:space="preserve"> msg</w:t>
+      </w:r>
+      <w:r>
+        <w:rPr>
+          <w:rFonts w:ascii="Consolas" w:hAnsi="Consolas" w:cs="Courier New"/>
+          <w:color w:val="666600"/>
+          <w:sz w:val="17"/>
+          <w:szCs w:val="17"/>
+        </w:rPr>
+        <w:t>],</w:t>
+      </w:r>
+      <w:r>
+        <w:rPr>
+          <w:rFonts w:ascii="Consolas" w:hAnsi="Consolas" w:cs="Courier New"/>
+          <w:color w:val="000000"/>
+          <w:sz w:val="17"/>
+          <w:szCs w:val="17"/>
+        </w:rPr>
+        <w:t xml:space="preserve"> </w:t>
+      </w:r>
+      <w:proofErr w:type="spellStart"/>
+      <w:r>
+        <w:rPr>
+          <w:rFonts w:ascii="Consolas" w:hAnsi="Consolas" w:cs="Courier New"/>
+          <w:color w:val="000000"/>
+          <w:sz w:val="17"/>
+          <w:szCs w:val="17"/>
+        </w:rPr>
+        <w:t>cwd</w:t>
+      </w:r>
+      <w:proofErr w:type="spellEnd"/>
+      <w:r>
+        <w:rPr>
+          <w:rFonts w:ascii="Consolas" w:hAnsi="Consolas" w:cs="Courier New"/>
+          <w:color w:val="666600"/>
+          <w:sz w:val="17"/>
+          <w:szCs w:val="17"/>
+        </w:rPr>
+        <w:t>=</w:t>
+      </w:r>
+      <w:r>
+        <w:rPr>
+          <w:rFonts w:ascii="Consolas" w:hAnsi="Consolas" w:cs="Courier New"/>
+          <w:color w:val="000000"/>
+          <w:sz w:val="17"/>
+          <w:szCs w:val="17"/>
+        </w:rPr>
+        <w:t>path</w:t>
+      </w:r>
+      <w:r>
+        <w:rPr>
+          <w:rFonts w:ascii="Consolas" w:hAnsi="Consolas" w:cs="Courier New"/>
+          <w:color w:val="666600"/>
+          <w:sz w:val="17"/>
+          <w:szCs w:val="17"/>
+        </w:rPr>
+        <w:t>)</w:t>
+      </w:r>
     </w:p>
     <w:p>
       <w:pPr>
@@ -8474,6 +8856,7 @@
   <w:style w:type="character" w:default="1" w:styleId="DefaultParagraphFont">
     <w:name w:val="Default Paragraph Font"/>
     <w:uiPriority w:val="1"/>
+    <w:semiHidden/>
     <w:unhideWhenUsed/>
   </w:style>
   <w:style w:type="table" w:default="1" w:styleId="TableNormal">

</xml_diff>

<commit_message>
"Updating doc and pdf for final solution"
</commit_message>
<xml_diff>
--- a/scripts/update_repos/script_to_update_all_repos.docx
+++ b/scripts/update_repos/script_to_update_all_repos.docx
@@ -6588,7 +6588,15 @@
       </w:r>
     </w:p>
     <w:p>
-      <w:r>
+      <w:pPr>
+        <w:rPr>
+          <w:color w:val="EE0000"/>
+        </w:rPr>
+      </w:pPr>
+      <w:r>
+        <w:rPr>
+          <w:color w:val="EE0000"/>
+        </w:rPr>
         <w:t>Issue #1: The script did not update GitHub.</w:t>
       </w:r>
     </w:p>
@@ -7043,18 +7051,3243 @@
           <w:rFonts w:asciiTheme="minorHAnsi" w:hAnsiTheme="minorHAnsi" w:cstheme="minorHAnsi"/>
         </w:rPr>
       </w:pPr>
-    </w:p>
-    <w:p>
-      <w:pPr>
+      <w:r>
         <w:rPr>
           <w:rStyle w:val="Code-Consolas"/>
           <w:rFonts w:asciiTheme="minorHAnsi" w:hAnsiTheme="minorHAnsi" w:cstheme="minorHAnsi"/>
         </w:rPr>
+        <w:t>Issue #2: The repo name gets lost in all the output.</w:t>
+      </w:r>
+    </w:p>
+    <w:p>
+      <w:pPr>
+        <w:rPr>
+          <w:rStyle w:val="Code-Consolas"/>
+          <w:rFonts w:asciiTheme="minorHAnsi" w:hAnsiTheme="minorHAnsi" w:cstheme="minorHAnsi"/>
+        </w:rPr>
+      </w:pPr>
+      <w:r>
+        <w:rPr>
+          <w:rStyle w:val="Code-Consolas"/>
+          <w:rFonts w:asciiTheme="minorHAnsi" w:hAnsiTheme="minorHAnsi" w:cstheme="minorHAnsi"/>
+        </w:rPr>
+        <w:t>Add color:</w:t>
+      </w:r>
+    </w:p>
+    <w:p>
+      <w:pPr>
+        <w:rPr>
+          <w:rStyle w:val="Code-Consolas"/>
+        </w:rPr>
+      </w:pPr>
+      <w:r>
+        <w:rPr>
+          <w:rStyle w:val="Code-Consolas"/>
+        </w:rPr>
+        <w:t>CYAN = "\033[96m"</w:t>
+      </w:r>
+      <w:r>
+        <w:rPr>
+          <w:rStyle w:val="Code-Consolas"/>
+        </w:rPr>
+        <w:br/>
+        <w:t>RESET = "\033[0m"</w:t>
+      </w:r>
+    </w:p>
+    <w:p>
+      <w:pPr>
+        <w:rPr>
+          <w:rStyle w:val="Code-Consolas"/>
+          <w:rFonts w:asciiTheme="minorHAnsi" w:hAnsiTheme="minorHAnsi" w:cstheme="minorHAnsi"/>
+        </w:rPr>
+      </w:pPr>
+    </w:p>
+    <w:p>
+      <w:pPr>
+        <w:rPr>
+          <w:rStyle w:val="Code-Consolas"/>
+          <w:rFonts w:asciiTheme="minorHAnsi" w:hAnsiTheme="minorHAnsi" w:cstheme="minorHAnsi"/>
+        </w:rPr>
+      </w:pPr>
+      <w:r>
+        <w:rPr>
+          <w:rStyle w:val="Code-Consolas"/>
+          <w:rFonts w:asciiTheme="minorHAnsi" w:hAnsiTheme="minorHAnsi" w:cstheme="minorHAnsi"/>
+        </w:rPr>
+        <w:t xml:space="preserve">And </w:t>
+      </w:r>
+    </w:p>
+    <w:p>
+      <w:pPr>
+        <w:rPr>
+          <w:rStyle w:val="Code-Consolas"/>
+        </w:rPr>
+      </w:pPr>
+      <w:r>
+        <w:rPr>
+          <w:rStyle w:val="Code-Consolas"/>
+        </w:rPr>
+        <w:t>print(f"\n{CYAN}=== Checking repo: {path} ==={RESET}")</w:t>
+      </w:r>
+    </w:p>
+    <w:p>
+      <w:pPr>
+        <w:rPr>
+          <w:rStyle w:val="Code-Consolas"/>
+          <w:rFonts w:asciiTheme="minorHAnsi" w:hAnsiTheme="minorHAnsi" w:cstheme="minorHAnsi"/>
+        </w:rPr>
+      </w:pPr>
+    </w:p>
+    <w:p>
+      <w:pPr>
+        <w:rPr>
+          <w:rStyle w:val="Code-Consolas"/>
+          <w:rFonts w:asciiTheme="minorHAnsi" w:hAnsiTheme="minorHAnsi" w:cstheme="minorHAnsi"/>
+        </w:rPr>
+      </w:pPr>
+      <w:r>
+        <w:rPr>
+          <w:rStyle w:val="Code-Consolas"/>
+          <w:rFonts w:asciiTheme="minorHAnsi" w:hAnsiTheme="minorHAnsi" w:cstheme="minorHAnsi"/>
+        </w:rPr>
+        <w:t xml:space="preserve">Did not work. I had to enter: </w:t>
+      </w:r>
+    </w:p>
+    <w:p>
+      <w:pPr>
+        <w:rPr>
+          <w:rStyle w:val="Code-Consolas"/>
+        </w:rPr>
+      </w:pPr>
+      <w:r>
+        <w:rPr>
+          <w:rStyle w:val="Code-Consolas"/>
+        </w:rPr>
+        <w:lastRenderedPageBreak/>
+        <w:t xml:space="preserve">reg add HKCU\Console /v </w:t>
+      </w:r>
+      <w:proofErr w:type="spellStart"/>
+      <w:r>
+        <w:rPr>
+          <w:rStyle w:val="Code-Consolas"/>
+        </w:rPr>
+        <w:t>VirtualTerminalLevel</w:t>
+      </w:r>
+      <w:proofErr w:type="spellEnd"/>
+      <w:r>
+        <w:rPr>
+          <w:rStyle w:val="Code-Consolas"/>
+        </w:rPr>
+        <w:t xml:space="preserve"> /t REG_DWORD /d 1 /f</w:t>
+      </w:r>
+    </w:p>
+    <w:p>
+      <w:pPr>
+        <w:rPr>
+          <w:rStyle w:val="Code-Consolas"/>
+          <w:rFonts w:asciiTheme="minorHAnsi" w:hAnsiTheme="minorHAnsi" w:cstheme="minorHAnsi"/>
+        </w:rPr>
+      </w:pPr>
+    </w:p>
+    <w:p>
+      <w:pPr>
+        <w:rPr>
+          <w:rStyle w:val="Code-Consolas"/>
+          <w:rFonts w:asciiTheme="minorHAnsi" w:hAnsiTheme="minorHAnsi" w:cstheme="minorHAnsi"/>
+        </w:rPr>
+      </w:pPr>
+      <w:r>
+        <w:rPr>
+          <w:rStyle w:val="Code-Consolas"/>
+          <w:rFonts w:asciiTheme="minorHAnsi" w:hAnsiTheme="minorHAnsi" w:cstheme="minorHAnsi"/>
+        </w:rPr>
+        <w:t>I closed the CMD prompt and opened a new one and got:</w:t>
+      </w:r>
+    </w:p>
+    <w:p>
+      <w:pPr>
+        <w:rPr>
+          <w:rStyle w:val="Code-Consolas"/>
+          <w:rFonts w:asciiTheme="minorHAnsi" w:hAnsiTheme="minorHAnsi" w:cstheme="minorHAnsi"/>
+        </w:rPr>
+      </w:pPr>
+      <w:r>
+        <w:rPr>
+          <w:rStyle w:val="Code-Consolas"/>
+          <w:rFonts w:asciiTheme="minorHAnsi" w:hAnsiTheme="minorHAnsi" w:cstheme="minorHAnsi"/>
+        </w:rPr>
+        <w:drawing>
+          <wp:inline distT="0" distB="0" distL="0" distR="0" wp14:anchorId="1DEC7E6E" wp14:editId="3EDBA375">
+            <wp:extent cx="5943600" cy="3173095"/>
+            <wp:effectExtent l="0" t="0" r="0" b="8255"/>
+            <wp:docPr id="1773097903" name="Picture 1"/>
+            <wp:cNvGraphicFramePr>
+              <a:graphicFrameLocks xmlns:a="http://schemas.openxmlformats.org/drawingml/2006/main" noChangeAspect="1"/>
+            </wp:cNvGraphicFramePr>
+            <a:graphic xmlns:a="http://schemas.openxmlformats.org/drawingml/2006/main">
+              <a:graphicData uri="http://schemas.openxmlformats.org/drawingml/2006/picture">
+                <pic:pic xmlns:pic="http://schemas.openxmlformats.org/drawingml/2006/picture">
+                  <pic:nvPicPr>
+                    <pic:cNvPr id="1773097903" name=""/>
+                    <pic:cNvPicPr/>
+                  </pic:nvPicPr>
+                  <pic:blipFill>
+                    <a:blip r:embed="rId10"/>
+                    <a:stretch>
+                      <a:fillRect/>
+                    </a:stretch>
+                  </pic:blipFill>
+                  <pic:spPr>
+                    <a:xfrm>
+                      <a:off x="0" y="0"/>
+                      <a:ext cx="5943600" cy="3173095"/>
+                    </a:xfrm>
+                    <a:prstGeom prst="rect">
+                      <a:avLst/>
+                    </a:prstGeom>
+                  </pic:spPr>
+                </pic:pic>
+              </a:graphicData>
+            </a:graphic>
+          </wp:inline>
+        </w:drawing>
+      </w:r>
+    </w:p>
+    <w:p>
+      <w:pPr>
+        <w:pStyle w:val="Heading1"/>
+        <w:rPr>
+          <w:rStyle w:val="Code-Consolas"/>
+          <w:rFonts w:asciiTheme="majorHAnsi" w:hAnsiTheme="majorHAnsi"/>
+        </w:rPr>
+      </w:pPr>
+      <w:r>
+        <w:rPr>
+          <w:rStyle w:val="Code-Consolas"/>
+          <w:rFonts w:asciiTheme="majorHAnsi" w:hAnsiTheme="majorHAnsi"/>
+        </w:rPr>
+        <w:t>Final Script Code</w:t>
+      </w:r>
+    </w:p>
+    <w:p>
+      <w:pPr>
+        <w:shd w:val="clear" w:color="auto" w:fill="131314"/>
+        <w:tabs>
+          <w:tab w:val="left" w:pos="916"/>
+          <w:tab w:val="left" w:pos="1832"/>
+          <w:tab w:val="left" w:pos="2748"/>
+          <w:tab w:val="left" w:pos="3664"/>
+          <w:tab w:val="left" w:pos="4580"/>
+          <w:tab w:val="left" w:pos="5496"/>
+          <w:tab w:val="left" w:pos="6412"/>
+          <w:tab w:val="left" w:pos="7328"/>
+          <w:tab w:val="left" w:pos="8244"/>
+          <w:tab w:val="left" w:pos="9160"/>
+          <w:tab w:val="left" w:pos="10076"/>
+          <w:tab w:val="left" w:pos="10992"/>
+          <w:tab w:val="left" w:pos="11908"/>
+          <w:tab w:val="left" w:pos="12824"/>
+          <w:tab w:val="left" w:pos="13740"/>
+          <w:tab w:val="left" w:pos="14656"/>
+        </w:tabs>
+        <w:spacing w:after="0" w:line="240" w:lineRule="auto"/>
+        <w:rPr>
+          <w:rFonts w:ascii="JetBrains Mono" w:eastAsia="Times New Roman" w:hAnsi="JetBrains Mono" w:cs="Courier New"/>
+          <w:color w:val="EBEBEB"/>
+          <w:kern w:val="0"/>
+          <w:sz w:val="16"/>
+          <w:szCs w:val="16"/>
+          <w14:ligatures w14:val="none"/>
+        </w:rPr>
+      </w:pPr>
+      <w:r>
+        <w:rPr>
+          <w:rFonts w:ascii="JetBrains Mono" w:eastAsia="Times New Roman" w:hAnsi="JetBrains Mono" w:cs="Courier New"/>
+          <w:color w:val="ED864A"/>
+          <w:kern w:val="0"/>
+          <w:sz w:val="16"/>
+          <w:szCs w:val="16"/>
+          <w14:ligatures w14:val="none"/>
+        </w:rPr>
+        <w:t xml:space="preserve">import </w:t>
+      </w:r>
+      <w:proofErr w:type="spellStart"/>
+      <w:r>
+        <w:rPr>
+          <w:rFonts w:ascii="JetBrains Mono" w:eastAsia="Times New Roman" w:hAnsi="JetBrains Mono" w:cs="Courier New"/>
+          <w:color w:val="EBEBEB"/>
+          <w:kern w:val="0"/>
+          <w:sz w:val="16"/>
+          <w:szCs w:val="16"/>
+          <w14:ligatures w14:val="none"/>
+        </w:rPr>
+        <w:t>os</w:t>
+      </w:r>
+      <w:proofErr w:type="spellEnd"/>
+      <w:r>
+        <w:rPr>
+          <w:rFonts w:ascii="JetBrains Mono" w:eastAsia="Times New Roman" w:hAnsi="JetBrains Mono" w:cs="Courier New"/>
+          <w:color w:val="EBEBEB"/>
+          <w:kern w:val="0"/>
+          <w:sz w:val="16"/>
+          <w:szCs w:val="16"/>
+          <w14:ligatures w14:val="none"/>
+        </w:rPr>
+        <w:br/>
+      </w:r>
+      <w:r>
+        <w:rPr>
+          <w:rFonts w:ascii="JetBrains Mono" w:eastAsia="Times New Roman" w:hAnsi="JetBrains Mono" w:cs="Courier New"/>
+          <w:color w:val="ED864A"/>
+          <w:kern w:val="0"/>
+          <w:sz w:val="16"/>
+          <w:szCs w:val="16"/>
+          <w14:ligatures w14:val="none"/>
+        </w:rPr>
+        <w:t xml:space="preserve">import </w:t>
+      </w:r>
+      <w:r>
+        <w:rPr>
+          <w:rFonts w:ascii="JetBrains Mono" w:eastAsia="Times New Roman" w:hAnsi="JetBrains Mono" w:cs="Courier New"/>
+          <w:color w:val="EBEBEB"/>
+          <w:kern w:val="0"/>
+          <w:sz w:val="16"/>
+          <w:szCs w:val="16"/>
+          <w14:ligatures w14:val="none"/>
+        </w:rPr>
+        <w:t>subprocess</w:t>
+      </w:r>
+      <w:r>
+        <w:rPr>
+          <w:rFonts w:ascii="JetBrains Mono" w:eastAsia="Times New Roman" w:hAnsi="JetBrains Mono" w:cs="Courier New"/>
+          <w:color w:val="EBEBEB"/>
+          <w:kern w:val="0"/>
+          <w:sz w:val="16"/>
+          <w:szCs w:val="16"/>
+          <w14:ligatures w14:val="none"/>
+        </w:rPr>
+        <w:br/>
+      </w:r>
+      <w:r>
+        <w:rPr>
+          <w:rFonts w:ascii="JetBrains Mono" w:eastAsia="Times New Roman" w:hAnsi="JetBrains Mono" w:cs="Courier New"/>
+          <w:color w:val="EBEBEB"/>
+          <w:kern w:val="0"/>
+          <w:sz w:val="16"/>
+          <w:szCs w:val="16"/>
+          <w14:ligatures w14:val="none"/>
+        </w:rPr>
+        <w:br/>
+      </w:r>
+      <w:r>
+        <w:rPr>
+          <w:rFonts w:ascii="JetBrains Mono" w:eastAsia="Times New Roman" w:hAnsi="JetBrains Mono" w:cs="Courier New"/>
+          <w:color w:val="7EC3E6"/>
+          <w:kern w:val="0"/>
+          <w:sz w:val="16"/>
+          <w:szCs w:val="16"/>
+          <w14:ligatures w14:val="none"/>
+        </w:rPr>
+        <w:t># List of repo directories (absolute paths recommended)</w:t>
+      </w:r>
+      <w:r>
+        <w:rPr>
+          <w:rFonts w:ascii="JetBrains Mono" w:eastAsia="Times New Roman" w:hAnsi="JetBrains Mono" w:cs="Courier New"/>
+          <w:color w:val="7EC3E6"/>
+          <w:kern w:val="0"/>
+          <w:sz w:val="16"/>
+          <w:szCs w:val="16"/>
+          <w14:ligatures w14:val="none"/>
+        </w:rPr>
+        <w:br/>
+      </w:r>
+      <w:r>
+        <w:rPr>
+          <w:rFonts w:ascii="JetBrains Mono" w:eastAsia="Times New Roman" w:hAnsi="JetBrains Mono" w:cs="Courier New"/>
+          <w:color w:val="EBEBEB"/>
+          <w:kern w:val="0"/>
+          <w:sz w:val="16"/>
+          <w:szCs w:val="16"/>
+          <w14:ligatures w14:val="none"/>
+        </w:rPr>
+        <w:t>REPOS = [</w:t>
+      </w:r>
+      <w:r>
+        <w:rPr>
+          <w:rFonts w:ascii="JetBrains Mono" w:eastAsia="Times New Roman" w:hAnsi="JetBrains Mono" w:cs="Courier New"/>
+          <w:color w:val="EBEBEB"/>
+          <w:kern w:val="0"/>
+          <w:sz w:val="16"/>
+          <w:szCs w:val="16"/>
+          <w14:ligatures w14:val="none"/>
+        </w:rPr>
+        <w:br/>
+        <w:t xml:space="preserve">    </w:t>
+      </w:r>
+      <w:proofErr w:type="spellStart"/>
+      <w:r>
+        <w:rPr>
+          <w:rFonts w:ascii="JetBrains Mono" w:eastAsia="Times New Roman" w:hAnsi="JetBrains Mono" w:cs="Courier New"/>
+          <w:color w:val="54B33E"/>
+          <w:kern w:val="0"/>
+          <w:sz w:val="16"/>
+          <w:szCs w:val="16"/>
+          <w14:ligatures w14:val="none"/>
+        </w:rPr>
+        <w:t>r"C</w:t>
+      </w:r>
+      <w:proofErr w:type="spellEnd"/>
+      <w:r>
+        <w:rPr>
+          <w:rFonts w:ascii="JetBrains Mono" w:eastAsia="Times New Roman" w:hAnsi="JetBrains Mono" w:cs="Courier New"/>
+          <w:color w:val="54B33E"/>
+          <w:kern w:val="0"/>
+          <w:sz w:val="16"/>
+          <w:szCs w:val="16"/>
+          <w14:ligatures w14:val="none"/>
+        </w:rPr>
+        <w:t>:\1000-days-of-code"</w:t>
+      </w:r>
+      <w:r>
+        <w:rPr>
+          <w:rFonts w:ascii="JetBrains Mono" w:eastAsia="Times New Roman" w:hAnsi="JetBrains Mono" w:cs="Courier New"/>
+          <w:b/>
+          <w:bCs/>
+          <w:color w:val="ED864A"/>
+          <w:kern w:val="0"/>
+          <w:sz w:val="16"/>
+          <w:szCs w:val="16"/>
+          <w14:ligatures w14:val="none"/>
+        </w:rPr>
+        <w:t xml:space="preserve">,    </w:t>
+      </w:r>
+      <w:r>
+        <w:rPr>
+          <w:rFonts w:ascii="JetBrains Mono" w:eastAsia="Times New Roman" w:hAnsi="JetBrains Mono" w:cs="Courier New"/>
+          <w:color w:val="7EC3E6"/>
+          <w:kern w:val="0"/>
+          <w:sz w:val="16"/>
+          <w:szCs w:val="16"/>
+          <w14:ligatures w14:val="none"/>
+        </w:rPr>
+        <w:t># original repo</w:t>
+      </w:r>
+      <w:r>
+        <w:rPr>
+          <w:rFonts w:ascii="JetBrains Mono" w:eastAsia="Times New Roman" w:hAnsi="JetBrains Mono" w:cs="Courier New"/>
+          <w:color w:val="7EC3E6"/>
+          <w:kern w:val="0"/>
+          <w:sz w:val="16"/>
+          <w:szCs w:val="16"/>
+          <w14:ligatures w14:val="none"/>
+        </w:rPr>
+        <w:br/>
+        <w:t xml:space="preserve">    </w:t>
+      </w:r>
+      <w:proofErr w:type="spellStart"/>
+      <w:r>
+        <w:rPr>
+          <w:rFonts w:ascii="JetBrains Mono" w:eastAsia="Times New Roman" w:hAnsi="JetBrains Mono" w:cs="Courier New"/>
+          <w:color w:val="54B33E"/>
+          <w:kern w:val="0"/>
+          <w:sz w:val="16"/>
+          <w:szCs w:val="16"/>
+          <w14:ligatures w14:val="none"/>
+        </w:rPr>
+        <w:t>r"C</w:t>
+      </w:r>
+      <w:proofErr w:type="spellEnd"/>
+      <w:r>
+        <w:rPr>
+          <w:rFonts w:ascii="JetBrains Mono" w:eastAsia="Times New Roman" w:hAnsi="JetBrains Mono" w:cs="Courier New"/>
+          <w:color w:val="54B33E"/>
+          <w:kern w:val="0"/>
+          <w:sz w:val="16"/>
+          <w:szCs w:val="16"/>
+          <w14:ligatures w14:val="none"/>
+        </w:rPr>
+        <w:t>:\1000-days-of-code-repos\1000doc-brainycode-website"</w:t>
+      </w:r>
+      <w:r>
+        <w:rPr>
+          <w:rFonts w:ascii="JetBrains Mono" w:eastAsia="Times New Roman" w:hAnsi="JetBrains Mono" w:cs="Courier New"/>
+          <w:b/>
+          <w:bCs/>
+          <w:color w:val="ED864A"/>
+          <w:kern w:val="0"/>
+          <w:sz w:val="16"/>
+          <w:szCs w:val="16"/>
+          <w14:ligatures w14:val="none"/>
+        </w:rPr>
+        <w:t>,</w:t>
+      </w:r>
+      <w:r>
+        <w:rPr>
+          <w:rFonts w:ascii="JetBrains Mono" w:eastAsia="Times New Roman" w:hAnsi="JetBrains Mono" w:cs="Courier New"/>
+          <w:b/>
+          <w:bCs/>
+          <w:color w:val="ED864A"/>
+          <w:kern w:val="0"/>
+          <w:sz w:val="16"/>
+          <w:szCs w:val="16"/>
+          <w14:ligatures w14:val="none"/>
+        </w:rPr>
+        <w:br/>
+        <w:t xml:space="preserve">    </w:t>
+      </w:r>
+      <w:proofErr w:type="spellStart"/>
+      <w:r>
+        <w:rPr>
+          <w:rFonts w:ascii="JetBrains Mono" w:eastAsia="Times New Roman" w:hAnsi="JetBrains Mono" w:cs="Courier New"/>
+          <w:color w:val="54B33E"/>
+          <w:kern w:val="0"/>
+          <w:sz w:val="16"/>
+          <w:szCs w:val="16"/>
+          <w14:ligatures w14:val="none"/>
+        </w:rPr>
+        <w:t>r"C</w:t>
+      </w:r>
+      <w:proofErr w:type="spellEnd"/>
+      <w:r>
+        <w:rPr>
+          <w:rFonts w:ascii="JetBrains Mono" w:eastAsia="Times New Roman" w:hAnsi="JetBrains Mono" w:cs="Courier New"/>
+          <w:color w:val="54B33E"/>
+          <w:kern w:val="0"/>
+          <w:sz w:val="16"/>
+          <w:szCs w:val="16"/>
+          <w14:ligatures w14:val="none"/>
+        </w:rPr>
+        <w:t>:\1000-days-of-code-repos\1000doc-coursera"</w:t>
+      </w:r>
+      <w:r>
+        <w:rPr>
+          <w:rFonts w:ascii="JetBrains Mono" w:eastAsia="Times New Roman" w:hAnsi="JetBrains Mono" w:cs="Courier New"/>
+          <w:b/>
+          <w:bCs/>
+          <w:color w:val="ED864A"/>
+          <w:kern w:val="0"/>
+          <w:sz w:val="16"/>
+          <w:szCs w:val="16"/>
+          <w14:ligatures w14:val="none"/>
+        </w:rPr>
+        <w:t>,</w:t>
+      </w:r>
+      <w:r>
+        <w:rPr>
+          <w:rFonts w:ascii="JetBrains Mono" w:eastAsia="Times New Roman" w:hAnsi="JetBrains Mono" w:cs="Courier New"/>
+          <w:b/>
+          <w:bCs/>
+          <w:color w:val="ED864A"/>
+          <w:kern w:val="0"/>
+          <w:sz w:val="16"/>
+          <w:szCs w:val="16"/>
+          <w14:ligatures w14:val="none"/>
+        </w:rPr>
+        <w:br/>
+        <w:t xml:space="preserve">    </w:t>
+      </w:r>
+      <w:proofErr w:type="spellStart"/>
+      <w:r>
+        <w:rPr>
+          <w:rFonts w:ascii="JetBrains Mono" w:eastAsia="Times New Roman" w:hAnsi="JetBrains Mono" w:cs="Courier New"/>
+          <w:color w:val="54B33E"/>
+          <w:kern w:val="0"/>
+          <w:sz w:val="16"/>
+          <w:szCs w:val="16"/>
+          <w14:ligatures w14:val="none"/>
+        </w:rPr>
+        <w:t>r"C</w:t>
+      </w:r>
+      <w:proofErr w:type="spellEnd"/>
+      <w:r>
+        <w:rPr>
+          <w:rFonts w:ascii="JetBrains Mono" w:eastAsia="Times New Roman" w:hAnsi="JetBrains Mono" w:cs="Courier New"/>
+          <w:color w:val="54B33E"/>
+          <w:kern w:val="0"/>
+          <w:sz w:val="16"/>
+          <w:szCs w:val="16"/>
+          <w14:ligatures w14:val="none"/>
+        </w:rPr>
+        <w:t>:\1000-days-of-code-repos\1000doc-docs"</w:t>
+      </w:r>
+      <w:r>
+        <w:rPr>
+          <w:rFonts w:ascii="JetBrains Mono" w:eastAsia="Times New Roman" w:hAnsi="JetBrains Mono" w:cs="Courier New"/>
+          <w:b/>
+          <w:bCs/>
+          <w:color w:val="ED864A"/>
+          <w:kern w:val="0"/>
+          <w:sz w:val="16"/>
+          <w:szCs w:val="16"/>
+          <w14:ligatures w14:val="none"/>
+        </w:rPr>
+        <w:t>,</w:t>
+      </w:r>
+      <w:r>
+        <w:rPr>
+          <w:rFonts w:ascii="JetBrains Mono" w:eastAsia="Times New Roman" w:hAnsi="JetBrains Mono" w:cs="Courier New"/>
+          <w:b/>
+          <w:bCs/>
+          <w:color w:val="ED864A"/>
+          <w:kern w:val="0"/>
+          <w:sz w:val="16"/>
+          <w:szCs w:val="16"/>
+          <w14:ligatures w14:val="none"/>
+        </w:rPr>
+        <w:br/>
+        <w:t xml:space="preserve">    </w:t>
+      </w:r>
+      <w:r>
+        <w:rPr>
+          <w:rFonts w:ascii="JetBrains Mono" w:eastAsia="Times New Roman" w:hAnsi="JetBrains Mono" w:cs="Courier New"/>
+          <w:color w:val="54B33E"/>
+          <w:kern w:val="0"/>
+          <w:sz w:val="16"/>
+          <w:szCs w:val="16"/>
+          <w14:ligatures w14:val="none"/>
+        </w:rPr>
+        <w:t>r"C:\1000-days-of-code-repos\1000doc-html-css-javascript-projects"</w:t>
+      </w:r>
+      <w:r>
+        <w:rPr>
+          <w:rFonts w:ascii="JetBrains Mono" w:eastAsia="Times New Roman" w:hAnsi="JetBrains Mono" w:cs="Courier New"/>
+          <w:b/>
+          <w:bCs/>
+          <w:color w:val="ED864A"/>
+          <w:kern w:val="0"/>
+          <w:sz w:val="16"/>
+          <w:szCs w:val="16"/>
+          <w14:ligatures w14:val="none"/>
+        </w:rPr>
+        <w:t>,</w:t>
+      </w:r>
+      <w:r>
+        <w:rPr>
+          <w:rFonts w:ascii="JetBrains Mono" w:eastAsia="Times New Roman" w:hAnsi="JetBrains Mono" w:cs="Courier New"/>
+          <w:b/>
+          <w:bCs/>
+          <w:color w:val="ED864A"/>
+          <w:kern w:val="0"/>
+          <w:sz w:val="16"/>
+          <w:szCs w:val="16"/>
+          <w14:ligatures w14:val="none"/>
+        </w:rPr>
+        <w:br/>
+        <w:t xml:space="preserve">    </w:t>
+      </w:r>
+      <w:proofErr w:type="spellStart"/>
+      <w:r>
+        <w:rPr>
+          <w:rFonts w:ascii="JetBrains Mono" w:eastAsia="Times New Roman" w:hAnsi="JetBrains Mono" w:cs="Courier New"/>
+          <w:color w:val="54B33E"/>
+          <w:kern w:val="0"/>
+          <w:sz w:val="16"/>
+          <w:szCs w:val="16"/>
+          <w14:ligatures w14:val="none"/>
+        </w:rPr>
+        <w:t>r"C</w:t>
+      </w:r>
+      <w:proofErr w:type="spellEnd"/>
+      <w:r>
+        <w:rPr>
+          <w:rFonts w:ascii="JetBrains Mono" w:eastAsia="Times New Roman" w:hAnsi="JetBrains Mono" w:cs="Courier New"/>
+          <w:color w:val="54B33E"/>
+          <w:kern w:val="0"/>
+          <w:sz w:val="16"/>
+          <w:szCs w:val="16"/>
+          <w14:ligatures w14:val="none"/>
+        </w:rPr>
+        <w:t>:\1000-days-of-code-repos\1000doc-intellij-projects"</w:t>
+      </w:r>
+      <w:r>
+        <w:rPr>
+          <w:rFonts w:ascii="JetBrains Mono" w:eastAsia="Times New Roman" w:hAnsi="JetBrains Mono" w:cs="Courier New"/>
+          <w:b/>
+          <w:bCs/>
+          <w:color w:val="ED864A"/>
+          <w:kern w:val="0"/>
+          <w:sz w:val="16"/>
+          <w:szCs w:val="16"/>
+          <w14:ligatures w14:val="none"/>
+        </w:rPr>
+        <w:t>,</w:t>
+      </w:r>
+      <w:r>
+        <w:rPr>
+          <w:rFonts w:ascii="JetBrains Mono" w:eastAsia="Times New Roman" w:hAnsi="JetBrains Mono" w:cs="Courier New"/>
+          <w:b/>
+          <w:bCs/>
+          <w:color w:val="ED864A"/>
+          <w:kern w:val="0"/>
+          <w:sz w:val="16"/>
+          <w:szCs w:val="16"/>
+          <w14:ligatures w14:val="none"/>
+        </w:rPr>
+        <w:br/>
+        <w:t xml:space="preserve">    </w:t>
+      </w:r>
+      <w:proofErr w:type="spellStart"/>
+      <w:r>
+        <w:rPr>
+          <w:rFonts w:ascii="JetBrains Mono" w:eastAsia="Times New Roman" w:hAnsi="JetBrains Mono" w:cs="Courier New"/>
+          <w:color w:val="54B33E"/>
+          <w:kern w:val="0"/>
+          <w:sz w:val="16"/>
+          <w:szCs w:val="16"/>
+          <w14:ligatures w14:val="none"/>
+        </w:rPr>
+        <w:t>r"C</w:t>
+      </w:r>
+      <w:proofErr w:type="spellEnd"/>
+      <w:r>
+        <w:rPr>
+          <w:rFonts w:ascii="JetBrains Mono" w:eastAsia="Times New Roman" w:hAnsi="JetBrains Mono" w:cs="Courier New"/>
+          <w:color w:val="54B33E"/>
+          <w:kern w:val="0"/>
+          <w:sz w:val="16"/>
+          <w:szCs w:val="16"/>
+          <w14:ligatures w14:val="none"/>
+        </w:rPr>
+        <w:t>:\1000-days-of-code-repos\1000doc-python-projects"</w:t>
+      </w:r>
+      <w:r>
+        <w:rPr>
+          <w:rFonts w:ascii="JetBrains Mono" w:eastAsia="Times New Roman" w:hAnsi="JetBrains Mono" w:cs="Courier New"/>
+          <w:b/>
+          <w:bCs/>
+          <w:color w:val="ED864A"/>
+          <w:kern w:val="0"/>
+          <w:sz w:val="16"/>
+          <w:szCs w:val="16"/>
+          <w14:ligatures w14:val="none"/>
+        </w:rPr>
+        <w:t>,</w:t>
+      </w:r>
+      <w:r>
+        <w:rPr>
+          <w:rFonts w:ascii="JetBrains Mono" w:eastAsia="Times New Roman" w:hAnsi="JetBrains Mono" w:cs="Courier New"/>
+          <w:b/>
+          <w:bCs/>
+          <w:color w:val="ED864A"/>
+          <w:kern w:val="0"/>
+          <w:sz w:val="16"/>
+          <w:szCs w:val="16"/>
+          <w14:ligatures w14:val="none"/>
+        </w:rPr>
+        <w:br/>
+        <w:t xml:space="preserve">    </w:t>
+      </w:r>
+      <w:proofErr w:type="spellStart"/>
+      <w:r>
+        <w:rPr>
+          <w:rFonts w:ascii="JetBrains Mono" w:eastAsia="Times New Roman" w:hAnsi="JetBrains Mono" w:cs="Courier New"/>
+          <w:color w:val="54B33E"/>
+          <w:kern w:val="0"/>
+          <w:sz w:val="16"/>
+          <w:szCs w:val="16"/>
+          <w14:ligatures w14:val="none"/>
+        </w:rPr>
+        <w:t>r"C</w:t>
+      </w:r>
+      <w:proofErr w:type="spellEnd"/>
+      <w:r>
+        <w:rPr>
+          <w:rFonts w:ascii="JetBrains Mono" w:eastAsia="Times New Roman" w:hAnsi="JetBrains Mono" w:cs="Courier New"/>
+          <w:color w:val="54B33E"/>
+          <w:kern w:val="0"/>
+          <w:sz w:val="16"/>
+          <w:szCs w:val="16"/>
+          <w14:ligatures w14:val="none"/>
+        </w:rPr>
+        <w:t>:\1000-days-of-code-repos\1000doc-react-projects"</w:t>
+      </w:r>
+      <w:r>
+        <w:rPr>
+          <w:rFonts w:ascii="JetBrains Mono" w:eastAsia="Times New Roman" w:hAnsi="JetBrains Mono" w:cs="Courier New"/>
+          <w:b/>
+          <w:bCs/>
+          <w:color w:val="ED864A"/>
+          <w:kern w:val="0"/>
+          <w:sz w:val="16"/>
+          <w:szCs w:val="16"/>
+          <w14:ligatures w14:val="none"/>
+        </w:rPr>
+        <w:t>,</w:t>
+      </w:r>
+      <w:r>
+        <w:rPr>
+          <w:rFonts w:ascii="JetBrains Mono" w:eastAsia="Times New Roman" w:hAnsi="JetBrains Mono" w:cs="Courier New"/>
+          <w:b/>
+          <w:bCs/>
+          <w:color w:val="ED864A"/>
+          <w:kern w:val="0"/>
+          <w:sz w:val="16"/>
+          <w:szCs w:val="16"/>
+          <w14:ligatures w14:val="none"/>
+        </w:rPr>
+        <w:br/>
+        <w:t xml:space="preserve">    </w:t>
+      </w:r>
+      <w:proofErr w:type="spellStart"/>
+      <w:r>
+        <w:rPr>
+          <w:rFonts w:ascii="JetBrains Mono" w:eastAsia="Times New Roman" w:hAnsi="JetBrains Mono" w:cs="Courier New"/>
+          <w:color w:val="54B33E"/>
+          <w:kern w:val="0"/>
+          <w:sz w:val="16"/>
+          <w:szCs w:val="16"/>
+          <w14:ligatures w14:val="none"/>
+        </w:rPr>
+        <w:t>r"C</w:t>
+      </w:r>
+      <w:proofErr w:type="spellEnd"/>
+      <w:r>
+        <w:rPr>
+          <w:rFonts w:ascii="JetBrains Mono" w:eastAsia="Times New Roman" w:hAnsi="JetBrains Mono" w:cs="Courier New"/>
+          <w:color w:val="54B33E"/>
+          <w:kern w:val="0"/>
+          <w:sz w:val="16"/>
+          <w:szCs w:val="16"/>
+          <w14:ligatures w14:val="none"/>
+        </w:rPr>
+        <w:t>:\1000-days-of-code-repos\1000doc-windows-programming"</w:t>
+      </w:r>
+      <w:r>
+        <w:rPr>
+          <w:rFonts w:ascii="JetBrains Mono" w:eastAsia="Times New Roman" w:hAnsi="JetBrains Mono" w:cs="Courier New"/>
+          <w:b/>
+          <w:bCs/>
+          <w:color w:val="ED864A"/>
+          <w:kern w:val="0"/>
+          <w:sz w:val="16"/>
+          <w:szCs w:val="16"/>
+          <w14:ligatures w14:val="none"/>
+        </w:rPr>
+        <w:t>,</w:t>
+      </w:r>
+      <w:r>
+        <w:rPr>
+          <w:rFonts w:ascii="JetBrains Mono" w:eastAsia="Times New Roman" w:hAnsi="JetBrains Mono" w:cs="Courier New"/>
+          <w:b/>
+          <w:bCs/>
+          <w:color w:val="ED864A"/>
+          <w:kern w:val="0"/>
+          <w:sz w:val="16"/>
+          <w:szCs w:val="16"/>
+          <w14:ligatures w14:val="none"/>
+        </w:rPr>
+        <w:br/>
+      </w:r>
+      <w:r>
+        <w:rPr>
+          <w:rFonts w:ascii="JetBrains Mono" w:eastAsia="Times New Roman" w:hAnsi="JetBrains Mono" w:cs="Courier New"/>
+          <w:color w:val="EBEBEB"/>
+          <w:kern w:val="0"/>
+          <w:sz w:val="16"/>
+          <w:szCs w:val="16"/>
+          <w14:ligatures w14:val="none"/>
+        </w:rPr>
+        <w:t>]</w:t>
+      </w:r>
+      <w:r>
+        <w:rPr>
+          <w:rFonts w:ascii="JetBrains Mono" w:eastAsia="Times New Roman" w:hAnsi="JetBrains Mono" w:cs="Courier New"/>
+          <w:color w:val="EBEBEB"/>
+          <w:kern w:val="0"/>
+          <w:sz w:val="16"/>
+          <w:szCs w:val="16"/>
+          <w14:ligatures w14:val="none"/>
+        </w:rPr>
+        <w:br/>
+      </w:r>
+      <w:r>
+        <w:rPr>
+          <w:rFonts w:ascii="JetBrains Mono" w:eastAsia="Times New Roman" w:hAnsi="JetBrains Mono" w:cs="Courier New"/>
+          <w:color w:val="EBEBEB"/>
+          <w:kern w:val="0"/>
+          <w:sz w:val="16"/>
+          <w:szCs w:val="16"/>
+          <w14:ligatures w14:val="none"/>
+        </w:rPr>
+        <w:br/>
+        <w:t xml:space="preserve">CYAN = </w:t>
+      </w:r>
+      <w:r>
+        <w:rPr>
+          <w:rFonts w:ascii="JetBrains Mono" w:eastAsia="Times New Roman" w:hAnsi="JetBrains Mono" w:cs="Courier New"/>
+          <w:color w:val="54B33E"/>
+          <w:kern w:val="0"/>
+          <w:sz w:val="16"/>
+          <w:szCs w:val="16"/>
+          <w14:ligatures w14:val="none"/>
+        </w:rPr>
+        <w:t>"</w:t>
+      </w:r>
+      <w:r>
+        <w:rPr>
+          <w:rFonts w:ascii="JetBrains Mono" w:eastAsia="Times New Roman" w:hAnsi="JetBrains Mono" w:cs="Courier New"/>
+          <w:color w:val="ED864A"/>
+          <w:kern w:val="0"/>
+          <w:sz w:val="16"/>
+          <w:szCs w:val="16"/>
+          <w14:ligatures w14:val="none"/>
+        </w:rPr>
+        <w:t>\033</w:t>
+      </w:r>
+      <w:r>
+        <w:rPr>
+          <w:rFonts w:ascii="JetBrains Mono" w:eastAsia="Times New Roman" w:hAnsi="JetBrains Mono" w:cs="Courier New"/>
+          <w:color w:val="54B33E"/>
+          <w:kern w:val="0"/>
+          <w:sz w:val="16"/>
+          <w:szCs w:val="16"/>
+          <w14:ligatures w14:val="none"/>
+        </w:rPr>
+        <w:t>[96m"</w:t>
+      </w:r>
+      <w:r>
+        <w:rPr>
+          <w:rFonts w:ascii="JetBrains Mono" w:eastAsia="Times New Roman" w:hAnsi="JetBrains Mono" w:cs="Courier New"/>
+          <w:color w:val="54B33E"/>
+          <w:kern w:val="0"/>
+          <w:sz w:val="16"/>
+          <w:szCs w:val="16"/>
+          <w14:ligatures w14:val="none"/>
+        </w:rPr>
+        <w:br/>
+      </w:r>
+      <w:r>
+        <w:rPr>
+          <w:rFonts w:ascii="JetBrains Mono" w:eastAsia="Times New Roman" w:hAnsi="JetBrains Mono" w:cs="Courier New"/>
+          <w:color w:val="EBEBEB"/>
+          <w:kern w:val="0"/>
+          <w:sz w:val="16"/>
+          <w:szCs w:val="16"/>
+          <w14:ligatures w14:val="none"/>
+        </w:rPr>
+        <w:t xml:space="preserve">RESET = </w:t>
+      </w:r>
+      <w:r>
+        <w:rPr>
+          <w:rFonts w:ascii="JetBrains Mono" w:eastAsia="Times New Roman" w:hAnsi="JetBrains Mono" w:cs="Courier New"/>
+          <w:color w:val="54B33E"/>
+          <w:kern w:val="0"/>
+          <w:sz w:val="16"/>
+          <w:szCs w:val="16"/>
+          <w14:ligatures w14:val="none"/>
+        </w:rPr>
+        <w:t>"</w:t>
+      </w:r>
+      <w:r>
+        <w:rPr>
+          <w:rFonts w:ascii="JetBrains Mono" w:eastAsia="Times New Roman" w:hAnsi="JetBrains Mono" w:cs="Courier New"/>
+          <w:color w:val="ED864A"/>
+          <w:kern w:val="0"/>
+          <w:sz w:val="16"/>
+          <w:szCs w:val="16"/>
+          <w14:ligatures w14:val="none"/>
+        </w:rPr>
+        <w:t>\033</w:t>
+      </w:r>
+      <w:r>
+        <w:rPr>
+          <w:rFonts w:ascii="JetBrains Mono" w:eastAsia="Times New Roman" w:hAnsi="JetBrains Mono" w:cs="Courier New"/>
+          <w:color w:val="54B33E"/>
+          <w:kern w:val="0"/>
+          <w:sz w:val="16"/>
+          <w:szCs w:val="16"/>
+          <w14:ligatures w14:val="none"/>
+        </w:rPr>
+        <w:t>[0m"</w:t>
+      </w:r>
+      <w:r>
+        <w:rPr>
+          <w:rFonts w:ascii="JetBrains Mono" w:eastAsia="Times New Roman" w:hAnsi="JetBrains Mono" w:cs="Courier New"/>
+          <w:color w:val="54B33E"/>
+          <w:kern w:val="0"/>
+          <w:sz w:val="16"/>
+          <w:szCs w:val="16"/>
+          <w14:ligatures w14:val="none"/>
+        </w:rPr>
+        <w:br/>
+      </w:r>
+      <w:r>
+        <w:rPr>
+          <w:rFonts w:ascii="JetBrains Mono" w:eastAsia="Times New Roman" w:hAnsi="JetBrains Mono" w:cs="Courier New"/>
+          <w:color w:val="54B33E"/>
+          <w:kern w:val="0"/>
+          <w:sz w:val="16"/>
+          <w:szCs w:val="16"/>
+          <w14:ligatures w14:val="none"/>
+        </w:rPr>
+        <w:br/>
+      </w:r>
+      <w:r>
+        <w:rPr>
+          <w:rFonts w:ascii="JetBrains Mono" w:eastAsia="Times New Roman" w:hAnsi="JetBrains Mono" w:cs="Courier New"/>
+          <w:color w:val="54B33E"/>
+          <w:kern w:val="0"/>
+          <w:sz w:val="16"/>
+          <w:szCs w:val="16"/>
+          <w14:ligatures w14:val="none"/>
+        </w:rPr>
+        <w:br/>
+      </w:r>
+      <w:r>
+        <w:rPr>
+          <w:rFonts w:ascii="JetBrains Mono" w:eastAsia="Times New Roman" w:hAnsi="JetBrains Mono" w:cs="Courier New"/>
+          <w:color w:val="ED864A"/>
+          <w:kern w:val="0"/>
+          <w:sz w:val="16"/>
+          <w:szCs w:val="16"/>
+          <w14:ligatures w14:val="none"/>
+        </w:rPr>
+        <w:t xml:space="preserve">def </w:t>
+      </w:r>
+      <w:r>
+        <w:rPr>
+          <w:rFonts w:ascii="JetBrains Mono" w:eastAsia="Times New Roman" w:hAnsi="JetBrains Mono" w:cs="Courier New"/>
+          <w:color w:val="FFCF40"/>
+          <w:kern w:val="0"/>
+          <w:sz w:val="16"/>
+          <w:szCs w:val="16"/>
+          <w14:ligatures w14:val="none"/>
+        </w:rPr>
+        <w:t>run</w:t>
+      </w:r>
+      <w:r>
+        <w:rPr>
+          <w:rFonts w:ascii="JetBrains Mono" w:eastAsia="Times New Roman" w:hAnsi="JetBrains Mono" w:cs="Courier New"/>
+          <w:color w:val="EBEBEB"/>
+          <w:kern w:val="0"/>
+          <w:sz w:val="16"/>
+          <w:szCs w:val="16"/>
+          <w14:ligatures w14:val="none"/>
+        </w:rPr>
+        <w:t>(</w:t>
+      </w:r>
+      <w:proofErr w:type="spellStart"/>
+      <w:r>
+        <w:rPr>
+          <w:rFonts w:ascii="JetBrains Mono" w:eastAsia="Times New Roman" w:hAnsi="JetBrains Mono" w:cs="Courier New"/>
+          <w:color w:val="FFFFFF"/>
+          <w:kern w:val="0"/>
+          <w:sz w:val="16"/>
+          <w:szCs w:val="16"/>
+          <w14:ligatures w14:val="none"/>
+        </w:rPr>
+        <w:t>cmd</w:t>
+      </w:r>
+      <w:proofErr w:type="spellEnd"/>
+      <w:r>
+        <w:rPr>
+          <w:rFonts w:ascii="JetBrains Mono" w:eastAsia="Times New Roman" w:hAnsi="JetBrains Mono" w:cs="Courier New"/>
+          <w:b/>
+          <w:bCs/>
+          <w:color w:val="ED864A"/>
+          <w:kern w:val="0"/>
+          <w:sz w:val="16"/>
+          <w:szCs w:val="16"/>
+          <w14:ligatures w14:val="none"/>
+        </w:rPr>
+        <w:t xml:space="preserve">, </w:t>
+      </w:r>
+      <w:proofErr w:type="spellStart"/>
+      <w:r>
+        <w:rPr>
+          <w:rFonts w:ascii="JetBrains Mono" w:eastAsia="Times New Roman" w:hAnsi="JetBrains Mono" w:cs="Courier New"/>
+          <w:color w:val="FFFFFF"/>
+          <w:kern w:val="0"/>
+          <w:sz w:val="16"/>
+          <w:szCs w:val="16"/>
+          <w14:ligatures w14:val="none"/>
+        </w:rPr>
+        <w:t>cwd</w:t>
+      </w:r>
+      <w:proofErr w:type="spellEnd"/>
+      <w:r>
+        <w:rPr>
+          <w:rFonts w:ascii="JetBrains Mono" w:eastAsia="Times New Roman" w:hAnsi="JetBrains Mono" w:cs="Courier New"/>
+          <w:color w:val="EBEBEB"/>
+          <w:kern w:val="0"/>
+          <w:sz w:val="16"/>
+          <w:szCs w:val="16"/>
+          <w14:ligatures w14:val="none"/>
+        </w:rPr>
+        <w:t>):</w:t>
+      </w:r>
+      <w:r>
+        <w:rPr>
+          <w:rFonts w:ascii="JetBrains Mono" w:eastAsia="Times New Roman" w:hAnsi="JetBrains Mono" w:cs="Courier New"/>
+          <w:color w:val="EBEBEB"/>
+          <w:kern w:val="0"/>
+          <w:sz w:val="16"/>
+          <w:szCs w:val="16"/>
+          <w14:ligatures w14:val="none"/>
+        </w:rPr>
+        <w:br/>
+        <w:t xml:space="preserve">    </w:t>
+      </w:r>
+      <w:r>
+        <w:rPr>
+          <w:rFonts w:ascii="JetBrains Mono" w:eastAsia="Times New Roman" w:hAnsi="JetBrains Mono" w:cs="Courier New"/>
+          <w:i/>
+          <w:iCs/>
+          <w:color w:val="499936"/>
+          <w:kern w:val="0"/>
+          <w:sz w:val="16"/>
+          <w:szCs w:val="16"/>
+          <w14:ligatures w14:val="none"/>
+        </w:rPr>
+        <w:t>"""Run a shell command inside a specific directory and return output."""</w:t>
+      </w:r>
+      <w:r>
+        <w:rPr>
+          <w:rFonts w:ascii="JetBrains Mono" w:eastAsia="Times New Roman" w:hAnsi="JetBrains Mono" w:cs="Courier New"/>
+          <w:i/>
+          <w:iCs/>
+          <w:color w:val="499936"/>
+          <w:kern w:val="0"/>
+          <w:sz w:val="16"/>
+          <w:szCs w:val="16"/>
+          <w14:ligatures w14:val="none"/>
+        </w:rPr>
+        <w:br/>
+        <w:t xml:space="preserve">    </w:t>
+      </w:r>
+      <w:r>
+        <w:rPr>
+          <w:rFonts w:ascii="JetBrains Mono" w:eastAsia="Times New Roman" w:hAnsi="JetBrains Mono" w:cs="Courier New"/>
+          <w:color w:val="EBEBEB"/>
+          <w:kern w:val="0"/>
+          <w:sz w:val="16"/>
+          <w:szCs w:val="16"/>
+          <w14:ligatures w14:val="none"/>
+        </w:rPr>
+        <w:t xml:space="preserve">result = </w:t>
+      </w:r>
+      <w:proofErr w:type="spellStart"/>
+      <w:r>
+        <w:rPr>
+          <w:rFonts w:ascii="JetBrains Mono" w:eastAsia="Times New Roman" w:hAnsi="JetBrains Mono" w:cs="Courier New"/>
+          <w:color w:val="EBEBEB"/>
+          <w:kern w:val="0"/>
+          <w:sz w:val="16"/>
+          <w:szCs w:val="16"/>
+          <w14:ligatures w14:val="none"/>
+        </w:rPr>
+        <w:t>subprocess.run</w:t>
+      </w:r>
+      <w:proofErr w:type="spellEnd"/>
+      <w:r>
+        <w:rPr>
+          <w:rFonts w:ascii="JetBrains Mono" w:eastAsia="Times New Roman" w:hAnsi="JetBrains Mono" w:cs="Courier New"/>
+          <w:color w:val="EBEBEB"/>
+          <w:kern w:val="0"/>
+          <w:sz w:val="16"/>
+          <w:szCs w:val="16"/>
+          <w14:ligatures w14:val="none"/>
+        </w:rPr>
+        <w:t>(</w:t>
+      </w:r>
+      <w:proofErr w:type="spellStart"/>
+      <w:r>
+        <w:rPr>
+          <w:rFonts w:ascii="JetBrains Mono" w:eastAsia="Times New Roman" w:hAnsi="JetBrains Mono" w:cs="Courier New"/>
+          <w:color w:val="FFFFFF"/>
+          <w:kern w:val="0"/>
+          <w:sz w:val="16"/>
+          <w:szCs w:val="16"/>
+          <w14:ligatures w14:val="none"/>
+        </w:rPr>
+        <w:t>cmd</w:t>
+      </w:r>
+      <w:proofErr w:type="spellEnd"/>
+      <w:r>
+        <w:rPr>
+          <w:rFonts w:ascii="JetBrains Mono" w:eastAsia="Times New Roman" w:hAnsi="JetBrains Mono" w:cs="Courier New"/>
+          <w:b/>
+          <w:bCs/>
+          <w:color w:val="ED864A"/>
+          <w:kern w:val="0"/>
+          <w:sz w:val="16"/>
+          <w:szCs w:val="16"/>
+          <w14:ligatures w14:val="none"/>
+        </w:rPr>
+        <w:t xml:space="preserve">, </w:t>
+      </w:r>
+      <w:proofErr w:type="spellStart"/>
+      <w:r>
+        <w:rPr>
+          <w:rFonts w:ascii="JetBrains Mono" w:eastAsia="Times New Roman" w:hAnsi="JetBrains Mono" w:cs="Courier New"/>
+          <w:color w:val="AA4926"/>
+          <w:kern w:val="0"/>
+          <w:sz w:val="16"/>
+          <w:szCs w:val="16"/>
+          <w14:ligatures w14:val="none"/>
+        </w:rPr>
+        <w:t>cwd</w:t>
+      </w:r>
+      <w:proofErr w:type="spellEnd"/>
+      <w:r>
+        <w:rPr>
+          <w:rFonts w:ascii="JetBrains Mono" w:eastAsia="Times New Roman" w:hAnsi="JetBrains Mono" w:cs="Courier New"/>
+          <w:color w:val="EBEBEB"/>
+          <w:kern w:val="0"/>
+          <w:sz w:val="16"/>
+          <w:szCs w:val="16"/>
+          <w14:ligatures w14:val="none"/>
+        </w:rPr>
+        <w:t>=</w:t>
+      </w:r>
+      <w:proofErr w:type="spellStart"/>
+      <w:r>
+        <w:rPr>
+          <w:rFonts w:ascii="JetBrains Mono" w:eastAsia="Times New Roman" w:hAnsi="JetBrains Mono" w:cs="Courier New"/>
+          <w:color w:val="FFFFFF"/>
+          <w:kern w:val="0"/>
+          <w:sz w:val="16"/>
+          <w:szCs w:val="16"/>
+          <w14:ligatures w14:val="none"/>
+        </w:rPr>
+        <w:t>cwd</w:t>
+      </w:r>
+      <w:proofErr w:type="spellEnd"/>
+      <w:r>
+        <w:rPr>
+          <w:rFonts w:ascii="JetBrains Mono" w:eastAsia="Times New Roman" w:hAnsi="JetBrains Mono" w:cs="Courier New"/>
+          <w:b/>
+          <w:bCs/>
+          <w:color w:val="ED864A"/>
+          <w:kern w:val="0"/>
+          <w:sz w:val="16"/>
+          <w:szCs w:val="16"/>
+          <w14:ligatures w14:val="none"/>
+        </w:rPr>
+        <w:t xml:space="preserve">, </w:t>
+      </w:r>
+      <w:proofErr w:type="spellStart"/>
+      <w:r>
+        <w:rPr>
+          <w:rFonts w:ascii="JetBrains Mono" w:eastAsia="Times New Roman" w:hAnsi="JetBrains Mono" w:cs="Courier New"/>
+          <w:color w:val="AA4926"/>
+          <w:kern w:val="0"/>
+          <w:sz w:val="16"/>
+          <w:szCs w:val="16"/>
+          <w14:ligatures w14:val="none"/>
+        </w:rPr>
+        <w:t>capture_output</w:t>
+      </w:r>
+      <w:proofErr w:type="spellEnd"/>
+      <w:r>
+        <w:rPr>
+          <w:rFonts w:ascii="JetBrains Mono" w:eastAsia="Times New Roman" w:hAnsi="JetBrains Mono" w:cs="Courier New"/>
+          <w:color w:val="EBEBEB"/>
+          <w:kern w:val="0"/>
+          <w:sz w:val="16"/>
+          <w:szCs w:val="16"/>
+          <w14:ligatures w14:val="none"/>
+        </w:rPr>
+        <w:t>=</w:t>
+      </w:r>
+      <w:r>
+        <w:rPr>
+          <w:rFonts w:ascii="JetBrains Mono" w:eastAsia="Times New Roman" w:hAnsi="JetBrains Mono" w:cs="Courier New"/>
+          <w:color w:val="ED864A"/>
+          <w:kern w:val="0"/>
+          <w:sz w:val="16"/>
+          <w:szCs w:val="16"/>
+          <w14:ligatures w14:val="none"/>
+        </w:rPr>
+        <w:t>True</w:t>
+      </w:r>
+      <w:r>
+        <w:rPr>
+          <w:rFonts w:ascii="JetBrains Mono" w:eastAsia="Times New Roman" w:hAnsi="JetBrains Mono" w:cs="Courier New"/>
+          <w:b/>
+          <w:bCs/>
+          <w:color w:val="ED864A"/>
+          <w:kern w:val="0"/>
+          <w:sz w:val="16"/>
+          <w:szCs w:val="16"/>
+          <w14:ligatures w14:val="none"/>
+        </w:rPr>
+        <w:t xml:space="preserve">, </w:t>
+      </w:r>
+      <w:r>
+        <w:rPr>
+          <w:rFonts w:ascii="JetBrains Mono" w:eastAsia="Times New Roman" w:hAnsi="JetBrains Mono" w:cs="Courier New"/>
+          <w:color w:val="AA4926"/>
+          <w:kern w:val="0"/>
+          <w:sz w:val="16"/>
+          <w:szCs w:val="16"/>
+          <w14:ligatures w14:val="none"/>
+        </w:rPr>
+        <w:t>text</w:t>
+      </w:r>
+      <w:r>
+        <w:rPr>
+          <w:rFonts w:ascii="JetBrains Mono" w:eastAsia="Times New Roman" w:hAnsi="JetBrains Mono" w:cs="Courier New"/>
+          <w:color w:val="EBEBEB"/>
+          <w:kern w:val="0"/>
+          <w:sz w:val="16"/>
+          <w:szCs w:val="16"/>
+          <w14:ligatures w14:val="none"/>
+        </w:rPr>
+        <w:t>=</w:t>
+      </w:r>
+      <w:r>
+        <w:rPr>
+          <w:rFonts w:ascii="JetBrains Mono" w:eastAsia="Times New Roman" w:hAnsi="JetBrains Mono" w:cs="Courier New"/>
+          <w:color w:val="ED864A"/>
+          <w:kern w:val="0"/>
+          <w:sz w:val="16"/>
+          <w:szCs w:val="16"/>
+          <w14:ligatures w14:val="none"/>
+        </w:rPr>
+        <w:t>True</w:t>
+      </w:r>
+      <w:r>
+        <w:rPr>
+          <w:rFonts w:ascii="JetBrains Mono" w:eastAsia="Times New Roman" w:hAnsi="JetBrains Mono" w:cs="Courier New"/>
+          <w:b/>
+          <w:bCs/>
+          <w:color w:val="ED864A"/>
+          <w:kern w:val="0"/>
+          <w:sz w:val="16"/>
+          <w:szCs w:val="16"/>
+          <w14:ligatures w14:val="none"/>
+        </w:rPr>
+        <w:t xml:space="preserve">, </w:t>
+      </w:r>
+      <w:r>
+        <w:rPr>
+          <w:rFonts w:ascii="JetBrains Mono" w:eastAsia="Times New Roman" w:hAnsi="JetBrains Mono" w:cs="Courier New"/>
+          <w:color w:val="AA4926"/>
+          <w:kern w:val="0"/>
+          <w:sz w:val="16"/>
+          <w:szCs w:val="16"/>
+          <w14:ligatures w14:val="none"/>
+        </w:rPr>
+        <w:t>shell</w:t>
+      </w:r>
+      <w:r>
+        <w:rPr>
+          <w:rFonts w:ascii="JetBrains Mono" w:eastAsia="Times New Roman" w:hAnsi="JetBrains Mono" w:cs="Courier New"/>
+          <w:color w:val="EBEBEB"/>
+          <w:kern w:val="0"/>
+          <w:sz w:val="16"/>
+          <w:szCs w:val="16"/>
+          <w14:ligatures w14:val="none"/>
+        </w:rPr>
+        <w:t>=</w:t>
+      </w:r>
+      <w:r>
+        <w:rPr>
+          <w:rFonts w:ascii="JetBrains Mono" w:eastAsia="Times New Roman" w:hAnsi="JetBrains Mono" w:cs="Courier New"/>
+          <w:color w:val="ED864A"/>
+          <w:kern w:val="0"/>
+          <w:sz w:val="16"/>
+          <w:szCs w:val="16"/>
+          <w14:ligatures w14:val="none"/>
+        </w:rPr>
+        <w:t>True</w:t>
+      </w:r>
+      <w:r>
+        <w:rPr>
+          <w:rFonts w:ascii="JetBrains Mono" w:eastAsia="Times New Roman" w:hAnsi="JetBrains Mono" w:cs="Courier New"/>
+          <w:color w:val="EBEBEB"/>
+          <w:kern w:val="0"/>
+          <w:sz w:val="16"/>
+          <w:szCs w:val="16"/>
+          <w14:ligatures w14:val="none"/>
+        </w:rPr>
+        <w:t>)</w:t>
+      </w:r>
+      <w:r>
+        <w:rPr>
+          <w:rFonts w:ascii="JetBrains Mono" w:eastAsia="Times New Roman" w:hAnsi="JetBrains Mono" w:cs="Courier New"/>
+          <w:color w:val="EBEBEB"/>
+          <w:kern w:val="0"/>
+          <w:sz w:val="16"/>
+          <w:szCs w:val="16"/>
+          <w14:ligatures w14:val="none"/>
+        </w:rPr>
+        <w:br/>
+        <w:t xml:space="preserve">    </w:t>
+      </w:r>
+      <w:r>
+        <w:rPr>
+          <w:rFonts w:ascii="JetBrains Mono" w:eastAsia="Times New Roman" w:hAnsi="JetBrains Mono" w:cs="Courier New"/>
+          <w:color w:val="ED864A"/>
+          <w:kern w:val="0"/>
+          <w:sz w:val="16"/>
+          <w:szCs w:val="16"/>
+          <w14:ligatures w14:val="none"/>
+        </w:rPr>
+        <w:t xml:space="preserve">return </w:t>
+      </w:r>
+      <w:proofErr w:type="spellStart"/>
+      <w:r>
+        <w:rPr>
+          <w:rFonts w:ascii="JetBrains Mono" w:eastAsia="Times New Roman" w:hAnsi="JetBrains Mono" w:cs="Courier New"/>
+          <w:color w:val="EBEBEB"/>
+          <w:kern w:val="0"/>
+          <w:sz w:val="16"/>
+          <w:szCs w:val="16"/>
+          <w14:ligatures w14:val="none"/>
+        </w:rPr>
+        <w:t>result.stdout.strip</w:t>
+      </w:r>
+      <w:proofErr w:type="spellEnd"/>
+      <w:r>
+        <w:rPr>
+          <w:rFonts w:ascii="JetBrains Mono" w:eastAsia="Times New Roman" w:hAnsi="JetBrains Mono" w:cs="Courier New"/>
+          <w:color w:val="EBEBEB"/>
+          <w:kern w:val="0"/>
+          <w:sz w:val="16"/>
+          <w:szCs w:val="16"/>
+          <w14:ligatures w14:val="none"/>
+        </w:rPr>
+        <w:t>()</w:t>
+      </w:r>
+      <w:r>
+        <w:rPr>
+          <w:rFonts w:ascii="JetBrains Mono" w:eastAsia="Times New Roman" w:hAnsi="JetBrains Mono" w:cs="Courier New"/>
+          <w:color w:val="EBEBEB"/>
+          <w:kern w:val="0"/>
+          <w:sz w:val="16"/>
+          <w:szCs w:val="16"/>
+          <w14:ligatures w14:val="none"/>
+        </w:rPr>
+        <w:br/>
+      </w:r>
+      <w:r>
+        <w:rPr>
+          <w:rFonts w:ascii="JetBrains Mono" w:eastAsia="Times New Roman" w:hAnsi="JetBrains Mono" w:cs="Courier New"/>
+          <w:color w:val="EBEBEB"/>
+          <w:kern w:val="0"/>
+          <w:sz w:val="16"/>
+          <w:szCs w:val="16"/>
+          <w14:ligatures w14:val="none"/>
+        </w:rPr>
+        <w:br/>
+      </w:r>
+      <w:r>
+        <w:rPr>
+          <w:rFonts w:ascii="JetBrains Mono" w:eastAsia="Times New Roman" w:hAnsi="JetBrains Mono" w:cs="Courier New"/>
+          <w:color w:val="EBEBEB"/>
+          <w:kern w:val="0"/>
+          <w:sz w:val="16"/>
+          <w:szCs w:val="16"/>
+          <w14:ligatures w14:val="none"/>
+        </w:rPr>
+        <w:br/>
+      </w:r>
+      <w:r>
+        <w:rPr>
+          <w:rFonts w:ascii="JetBrains Mono" w:eastAsia="Times New Roman" w:hAnsi="JetBrains Mono" w:cs="Courier New"/>
+          <w:color w:val="ED864A"/>
+          <w:kern w:val="0"/>
+          <w:sz w:val="16"/>
+          <w:szCs w:val="16"/>
+          <w14:ligatures w14:val="none"/>
+        </w:rPr>
+        <w:t xml:space="preserve">def </w:t>
+      </w:r>
+      <w:proofErr w:type="spellStart"/>
+      <w:r>
+        <w:rPr>
+          <w:rFonts w:ascii="JetBrains Mono" w:eastAsia="Times New Roman" w:hAnsi="JetBrains Mono" w:cs="Courier New"/>
+          <w:color w:val="FFCF40"/>
+          <w:kern w:val="0"/>
+          <w:sz w:val="16"/>
+          <w:szCs w:val="16"/>
+          <w14:ligatures w14:val="none"/>
+        </w:rPr>
+        <w:t>update_repo</w:t>
+      </w:r>
+      <w:proofErr w:type="spellEnd"/>
+      <w:r>
+        <w:rPr>
+          <w:rFonts w:ascii="JetBrains Mono" w:eastAsia="Times New Roman" w:hAnsi="JetBrains Mono" w:cs="Courier New"/>
+          <w:color w:val="EBEBEB"/>
+          <w:kern w:val="0"/>
+          <w:sz w:val="16"/>
+          <w:szCs w:val="16"/>
+          <w14:ligatures w14:val="none"/>
+        </w:rPr>
+        <w:t>(</w:t>
+      </w:r>
+      <w:r>
+        <w:rPr>
+          <w:rFonts w:ascii="JetBrains Mono" w:eastAsia="Times New Roman" w:hAnsi="JetBrains Mono" w:cs="Courier New"/>
+          <w:color w:val="FFFFFF"/>
+          <w:kern w:val="0"/>
+          <w:sz w:val="16"/>
+          <w:szCs w:val="16"/>
+          <w14:ligatures w14:val="none"/>
+        </w:rPr>
+        <w:t>path</w:t>
+      </w:r>
+      <w:r>
+        <w:rPr>
+          <w:rFonts w:ascii="JetBrains Mono" w:eastAsia="Times New Roman" w:hAnsi="JetBrains Mono" w:cs="Courier New"/>
+          <w:color w:val="EBEBEB"/>
+          <w:kern w:val="0"/>
+          <w:sz w:val="16"/>
+          <w:szCs w:val="16"/>
+          <w14:ligatures w14:val="none"/>
+        </w:rPr>
+        <w:t>):</w:t>
+      </w:r>
+      <w:r>
+        <w:rPr>
+          <w:rFonts w:ascii="JetBrains Mono" w:eastAsia="Times New Roman" w:hAnsi="JetBrains Mono" w:cs="Courier New"/>
+          <w:color w:val="EBEBEB"/>
+          <w:kern w:val="0"/>
+          <w:sz w:val="16"/>
+          <w:szCs w:val="16"/>
+          <w14:ligatures w14:val="none"/>
+        </w:rPr>
+        <w:br/>
+      </w:r>
+      <w:r>
+        <w:rPr>
+          <w:rFonts w:ascii="JetBrains Mono" w:eastAsia="Times New Roman" w:hAnsi="JetBrains Mono" w:cs="Courier New"/>
+          <w:color w:val="EBEBEB"/>
+          <w:kern w:val="0"/>
+          <w:sz w:val="16"/>
+          <w:szCs w:val="16"/>
+          <w14:ligatures w14:val="none"/>
+        </w:rPr>
+        <w:lastRenderedPageBreak/>
+        <w:t xml:space="preserve">    </w:t>
+      </w:r>
+      <w:r>
+        <w:rPr>
+          <w:rFonts w:ascii="JetBrains Mono" w:eastAsia="Times New Roman" w:hAnsi="JetBrains Mono" w:cs="Courier New"/>
+          <w:color w:val="8888C6"/>
+          <w:kern w:val="0"/>
+          <w:sz w:val="16"/>
+          <w:szCs w:val="16"/>
+          <w14:ligatures w14:val="none"/>
+        </w:rPr>
+        <w:t>print</w:t>
+      </w:r>
+      <w:r>
+        <w:rPr>
+          <w:rFonts w:ascii="JetBrains Mono" w:eastAsia="Times New Roman" w:hAnsi="JetBrains Mono" w:cs="Courier New"/>
+          <w:color w:val="EBEBEB"/>
+          <w:kern w:val="0"/>
+          <w:sz w:val="16"/>
+          <w:szCs w:val="16"/>
+          <w14:ligatures w14:val="none"/>
+        </w:rPr>
+        <w:t>(</w:t>
+      </w:r>
+      <w:r>
+        <w:rPr>
+          <w:rFonts w:ascii="JetBrains Mono" w:eastAsia="Times New Roman" w:hAnsi="JetBrains Mono" w:cs="Courier New"/>
+          <w:color w:val="54B33E"/>
+          <w:kern w:val="0"/>
+          <w:sz w:val="16"/>
+          <w:szCs w:val="16"/>
+          <w14:ligatures w14:val="none"/>
+        </w:rPr>
+        <w:t>f"</w:t>
+      </w:r>
+      <w:r>
+        <w:rPr>
+          <w:rFonts w:ascii="JetBrains Mono" w:eastAsia="Times New Roman" w:hAnsi="JetBrains Mono" w:cs="Courier New"/>
+          <w:color w:val="ED864A"/>
+          <w:kern w:val="0"/>
+          <w:sz w:val="16"/>
+          <w:szCs w:val="16"/>
+          <w14:ligatures w14:val="none"/>
+        </w:rPr>
+        <w:t>\n{</w:t>
+      </w:r>
+      <w:r>
+        <w:rPr>
+          <w:rFonts w:ascii="JetBrains Mono" w:eastAsia="Times New Roman" w:hAnsi="JetBrains Mono" w:cs="Courier New"/>
+          <w:color w:val="EBEBEB"/>
+          <w:kern w:val="0"/>
+          <w:sz w:val="16"/>
+          <w:szCs w:val="16"/>
+          <w14:ligatures w14:val="none"/>
+        </w:rPr>
+        <w:t>CYAN</w:t>
+      </w:r>
+      <w:r>
+        <w:rPr>
+          <w:rFonts w:ascii="JetBrains Mono" w:eastAsia="Times New Roman" w:hAnsi="JetBrains Mono" w:cs="Courier New"/>
+          <w:color w:val="ED864A"/>
+          <w:kern w:val="0"/>
+          <w:sz w:val="16"/>
+          <w:szCs w:val="16"/>
+          <w14:ligatures w14:val="none"/>
+        </w:rPr>
+        <w:t>}</w:t>
+      </w:r>
+      <w:r>
+        <w:rPr>
+          <w:rFonts w:ascii="JetBrains Mono" w:eastAsia="Times New Roman" w:hAnsi="JetBrains Mono" w:cs="Courier New"/>
+          <w:color w:val="54B33E"/>
+          <w:kern w:val="0"/>
+          <w:sz w:val="16"/>
+          <w:szCs w:val="16"/>
+          <w14:ligatures w14:val="none"/>
+        </w:rPr>
+        <w:t xml:space="preserve">=== Checking repo: </w:t>
+      </w:r>
+      <w:r>
+        <w:rPr>
+          <w:rFonts w:ascii="JetBrains Mono" w:eastAsia="Times New Roman" w:hAnsi="JetBrains Mono" w:cs="Courier New"/>
+          <w:color w:val="ED864A"/>
+          <w:kern w:val="0"/>
+          <w:sz w:val="16"/>
+          <w:szCs w:val="16"/>
+          <w14:ligatures w14:val="none"/>
+        </w:rPr>
+        <w:t>{</w:t>
+      </w:r>
+      <w:r>
+        <w:rPr>
+          <w:rFonts w:ascii="JetBrains Mono" w:eastAsia="Times New Roman" w:hAnsi="JetBrains Mono" w:cs="Courier New"/>
+          <w:color w:val="FFFFFF"/>
+          <w:kern w:val="0"/>
+          <w:sz w:val="16"/>
+          <w:szCs w:val="16"/>
+          <w14:ligatures w14:val="none"/>
+        </w:rPr>
+        <w:t>path</w:t>
+      </w:r>
+      <w:r>
+        <w:rPr>
+          <w:rFonts w:ascii="JetBrains Mono" w:eastAsia="Times New Roman" w:hAnsi="JetBrains Mono" w:cs="Courier New"/>
+          <w:color w:val="ED864A"/>
+          <w:kern w:val="0"/>
+          <w:sz w:val="16"/>
+          <w:szCs w:val="16"/>
+          <w14:ligatures w14:val="none"/>
+        </w:rPr>
+        <w:t>}</w:t>
+      </w:r>
+      <w:r>
+        <w:rPr>
+          <w:rFonts w:ascii="JetBrains Mono" w:eastAsia="Times New Roman" w:hAnsi="JetBrains Mono" w:cs="Courier New"/>
+          <w:color w:val="54B33E"/>
+          <w:kern w:val="0"/>
+          <w:sz w:val="16"/>
+          <w:szCs w:val="16"/>
+          <w14:ligatures w14:val="none"/>
+        </w:rPr>
+        <w:t xml:space="preserve"> ===</w:t>
+      </w:r>
+      <w:r>
+        <w:rPr>
+          <w:rFonts w:ascii="JetBrains Mono" w:eastAsia="Times New Roman" w:hAnsi="JetBrains Mono" w:cs="Courier New"/>
+          <w:color w:val="ED864A"/>
+          <w:kern w:val="0"/>
+          <w:sz w:val="16"/>
+          <w:szCs w:val="16"/>
+          <w14:ligatures w14:val="none"/>
+        </w:rPr>
+        <w:t>{</w:t>
+      </w:r>
+      <w:r>
+        <w:rPr>
+          <w:rFonts w:ascii="JetBrains Mono" w:eastAsia="Times New Roman" w:hAnsi="JetBrains Mono" w:cs="Courier New"/>
+          <w:color w:val="EBEBEB"/>
+          <w:kern w:val="0"/>
+          <w:sz w:val="16"/>
+          <w:szCs w:val="16"/>
+          <w14:ligatures w14:val="none"/>
+        </w:rPr>
+        <w:t>RESET</w:t>
+      </w:r>
+      <w:r>
+        <w:rPr>
+          <w:rFonts w:ascii="JetBrains Mono" w:eastAsia="Times New Roman" w:hAnsi="JetBrains Mono" w:cs="Courier New"/>
+          <w:color w:val="ED864A"/>
+          <w:kern w:val="0"/>
+          <w:sz w:val="16"/>
+          <w:szCs w:val="16"/>
+          <w14:ligatures w14:val="none"/>
+        </w:rPr>
+        <w:t>}</w:t>
+      </w:r>
+      <w:r>
+        <w:rPr>
+          <w:rFonts w:ascii="JetBrains Mono" w:eastAsia="Times New Roman" w:hAnsi="JetBrains Mono" w:cs="Courier New"/>
+          <w:color w:val="54B33E"/>
+          <w:kern w:val="0"/>
+          <w:sz w:val="16"/>
+          <w:szCs w:val="16"/>
+          <w14:ligatures w14:val="none"/>
+        </w:rPr>
+        <w:t>"</w:t>
+      </w:r>
+      <w:r>
+        <w:rPr>
+          <w:rFonts w:ascii="JetBrains Mono" w:eastAsia="Times New Roman" w:hAnsi="JetBrains Mono" w:cs="Courier New"/>
+          <w:color w:val="EBEBEB"/>
+          <w:kern w:val="0"/>
+          <w:sz w:val="16"/>
+          <w:szCs w:val="16"/>
+          <w14:ligatures w14:val="none"/>
+        </w:rPr>
+        <w:t>)</w:t>
+      </w:r>
+      <w:r>
+        <w:rPr>
+          <w:rFonts w:ascii="JetBrains Mono" w:eastAsia="Times New Roman" w:hAnsi="JetBrains Mono" w:cs="Courier New"/>
+          <w:color w:val="EBEBEB"/>
+          <w:kern w:val="0"/>
+          <w:sz w:val="16"/>
+          <w:szCs w:val="16"/>
+          <w14:ligatures w14:val="none"/>
+        </w:rPr>
+        <w:br/>
+      </w:r>
+      <w:r>
+        <w:rPr>
+          <w:rFonts w:ascii="JetBrains Mono" w:eastAsia="Times New Roman" w:hAnsi="JetBrains Mono" w:cs="Courier New"/>
+          <w:color w:val="EBEBEB"/>
+          <w:kern w:val="0"/>
+          <w:sz w:val="16"/>
+          <w:szCs w:val="16"/>
+          <w14:ligatures w14:val="none"/>
+        </w:rPr>
+        <w:br/>
+        <w:t xml:space="preserve">    </w:t>
+      </w:r>
+      <w:r>
+        <w:rPr>
+          <w:rFonts w:ascii="JetBrains Mono" w:eastAsia="Times New Roman" w:hAnsi="JetBrains Mono" w:cs="Courier New"/>
+          <w:color w:val="7EC3E6"/>
+          <w:kern w:val="0"/>
+          <w:sz w:val="16"/>
+          <w:szCs w:val="16"/>
+          <w14:ligatures w14:val="none"/>
+        </w:rPr>
+        <w:t># Check for changes</w:t>
+      </w:r>
+      <w:r>
+        <w:rPr>
+          <w:rFonts w:ascii="JetBrains Mono" w:eastAsia="Times New Roman" w:hAnsi="JetBrains Mono" w:cs="Courier New"/>
+          <w:color w:val="7EC3E6"/>
+          <w:kern w:val="0"/>
+          <w:sz w:val="16"/>
+          <w:szCs w:val="16"/>
+          <w14:ligatures w14:val="none"/>
+        </w:rPr>
+        <w:br/>
+        <w:t xml:space="preserve">    </w:t>
+      </w:r>
+      <w:r>
+        <w:rPr>
+          <w:rFonts w:ascii="JetBrains Mono" w:eastAsia="Times New Roman" w:hAnsi="JetBrains Mono" w:cs="Courier New"/>
+          <w:color w:val="EBEBEB"/>
+          <w:kern w:val="0"/>
+          <w:sz w:val="16"/>
+          <w:szCs w:val="16"/>
+          <w14:ligatures w14:val="none"/>
+        </w:rPr>
+        <w:t>status = run(</w:t>
+      </w:r>
+      <w:r>
+        <w:rPr>
+          <w:rFonts w:ascii="JetBrains Mono" w:eastAsia="Times New Roman" w:hAnsi="JetBrains Mono" w:cs="Courier New"/>
+          <w:color w:val="54B33E"/>
+          <w:kern w:val="0"/>
+          <w:sz w:val="16"/>
+          <w:szCs w:val="16"/>
+          <w14:ligatures w14:val="none"/>
+        </w:rPr>
+        <w:t>"git status --porcelain"</w:t>
+      </w:r>
+      <w:r>
+        <w:rPr>
+          <w:rFonts w:ascii="JetBrains Mono" w:eastAsia="Times New Roman" w:hAnsi="JetBrains Mono" w:cs="Courier New"/>
+          <w:b/>
+          <w:bCs/>
+          <w:color w:val="ED864A"/>
+          <w:kern w:val="0"/>
+          <w:sz w:val="16"/>
+          <w:szCs w:val="16"/>
+          <w14:ligatures w14:val="none"/>
+        </w:rPr>
+        <w:t xml:space="preserve">, </w:t>
+      </w:r>
+      <w:r>
+        <w:rPr>
+          <w:rFonts w:ascii="JetBrains Mono" w:eastAsia="Times New Roman" w:hAnsi="JetBrains Mono" w:cs="Courier New"/>
+          <w:color w:val="FFFFFF"/>
+          <w:kern w:val="0"/>
+          <w:sz w:val="16"/>
+          <w:szCs w:val="16"/>
+          <w14:ligatures w14:val="none"/>
+        </w:rPr>
+        <w:t>path</w:t>
+      </w:r>
+      <w:r>
+        <w:rPr>
+          <w:rFonts w:ascii="JetBrains Mono" w:eastAsia="Times New Roman" w:hAnsi="JetBrains Mono" w:cs="Courier New"/>
+          <w:color w:val="EBEBEB"/>
+          <w:kern w:val="0"/>
+          <w:sz w:val="16"/>
+          <w:szCs w:val="16"/>
+          <w14:ligatures w14:val="none"/>
+        </w:rPr>
+        <w:t>)</w:t>
+      </w:r>
+      <w:r>
+        <w:rPr>
+          <w:rFonts w:ascii="JetBrains Mono" w:eastAsia="Times New Roman" w:hAnsi="JetBrains Mono" w:cs="Courier New"/>
+          <w:color w:val="EBEBEB"/>
+          <w:kern w:val="0"/>
+          <w:sz w:val="16"/>
+          <w:szCs w:val="16"/>
+          <w14:ligatures w14:val="none"/>
+        </w:rPr>
+        <w:br/>
+      </w:r>
+      <w:r>
+        <w:rPr>
+          <w:rFonts w:ascii="JetBrains Mono" w:eastAsia="Times New Roman" w:hAnsi="JetBrains Mono" w:cs="Courier New"/>
+          <w:color w:val="EBEBEB"/>
+          <w:kern w:val="0"/>
+          <w:sz w:val="16"/>
+          <w:szCs w:val="16"/>
+          <w14:ligatures w14:val="none"/>
+        </w:rPr>
+        <w:br/>
+        <w:t xml:space="preserve">    </w:t>
+      </w:r>
+      <w:r>
+        <w:rPr>
+          <w:rFonts w:ascii="JetBrains Mono" w:eastAsia="Times New Roman" w:hAnsi="JetBrains Mono" w:cs="Courier New"/>
+          <w:color w:val="ED864A"/>
+          <w:kern w:val="0"/>
+          <w:sz w:val="16"/>
+          <w:szCs w:val="16"/>
+          <w14:ligatures w14:val="none"/>
+        </w:rPr>
+        <w:t xml:space="preserve">if not </w:t>
+      </w:r>
+      <w:r>
+        <w:rPr>
+          <w:rFonts w:ascii="JetBrains Mono" w:eastAsia="Times New Roman" w:hAnsi="JetBrains Mono" w:cs="Courier New"/>
+          <w:color w:val="EBEBEB"/>
+          <w:kern w:val="0"/>
+          <w:sz w:val="16"/>
+          <w:szCs w:val="16"/>
+          <w14:ligatures w14:val="none"/>
+        </w:rPr>
+        <w:t>status:</w:t>
+      </w:r>
+      <w:r>
+        <w:rPr>
+          <w:rFonts w:ascii="JetBrains Mono" w:eastAsia="Times New Roman" w:hAnsi="JetBrains Mono" w:cs="Courier New"/>
+          <w:color w:val="EBEBEB"/>
+          <w:kern w:val="0"/>
+          <w:sz w:val="16"/>
+          <w:szCs w:val="16"/>
+          <w14:ligatures w14:val="none"/>
+        </w:rPr>
+        <w:br/>
+        <w:t xml:space="preserve">        </w:t>
+      </w:r>
+      <w:r>
+        <w:rPr>
+          <w:rFonts w:ascii="JetBrains Mono" w:eastAsia="Times New Roman" w:hAnsi="JetBrains Mono" w:cs="Courier New"/>
+          <w:color w:val="8888C6"/>
+          <w:kern w:val="0"/>
+          <w:sz w:val="16"/>
+          <w:szCs w:val="16"/>
+          <w14:ligatures w14:val="none"/>
+        </w:rPr>
+        <w:t>print</w:t>
+      </w:r>
+      <w:r>
+        <w:rPr>
+          <w:rFonts w:ascii="JetBrains Mono" w:eastAsia="Times New Roman" w:hAnsi="JetBrains Mono" w:cs="Courier New"/>
+          <w:color w:val="EBEBEB"/>
+          <w:kern w:val="0"/>
+          <w:sz w:val="16"/>
+          <w:szCs w:val="16"/>
+          <w14:ligatures w14:val="none"/>
+        </w:rPr>
+        <w:t>(</w:t>
+      </w:r>
+      <w:r>
+        <w:rPr>
+          <w:rFonts w:ascii="JetBrains Mono" w:eastAsia="Times New Roman" w:hAnsi="JetBrains Mono" w:cs="Courier New"/>
+          <w:color w:val="54B33E"/>
+          <w:kern w:val="0"/>
+          <w:sz w:val="16"/>
+          <w:szCs w:val="16"/>
+          <w14:ligatures w14:val="none"/>
+        </w:rPr>
+        <w:t>"No changes. Skipping."</w:t>
+      </w:r>
+      <w:r>
+        <w:rPr>
+          <w:rFonts w:ascii="JetBrains Mono" w:eastAsia="Times New Roman" w:hAnsi="JetBrains Mono" w:cs="Courier New"/>
+          <w:color w:val="EBEBEB"/>
+          <w:kern w:val="0"/>
+          <w:sz w:val="16"/>
+          <w:szCs w:val="16"/>
+          <w14:ligatures w14:val="none"/>
+        </w:rPr>
+        <w:t>)</w:t>
+      </w:r>
+      <w:r>
+        <w:rPr>
+          <w:rFonts w:ascii="JetBrains Mono" w:eastAsia="Times New Roman" w:hAnsi="JetBrains Mono" w:cs="Courier New"/>
+          <w:color w:val="EBEBEB"/>
+          <w:kern w:val="0"/>
+          <w:sz w:val="16"/>
+          <w:szCs w:val="16"/>
+          <w14:ligatures w14:val="none"/>
+        </w:rPr>
+        <w:br/>
+        <w:t xml:space="preserve">        </w:t>
+      </w:r>
+      <w:r>
+        <w:rPr>
+          <w:rFonts w:ascii="JetBrains Mono" w:eastAsia="Times New Roman" w:hAnsi="JetBrains Mono" w:cs="Courier New"/>
+          <w:color w:val="ED864A"/>
+          <w:kern w:val="0"/>
+          <w:sz w:val="16"/>
+          <w:szCs w:val="16"/>
+          <w14:ligatures w14:val="none"/>
+        </w:rPr>
+        <w:t>return</w:t>
+      </w:r>
+      <w:r>
+        <w:rPr>
+          <w:rFonts w:ascii="JetBrains Mono" w:eastAsia="Times New Roman" w:hAnsi="JetBrains Mono" w:cs="Courier New"/>
+          <w:color w:val="ED864A"/>
+          <w:kern w:val="0"/>
+          <w:sz w:val="16"/>
+          <w:szCs w:val="16"/>
+          <w14:ligatures w14:val="none"/>
+        </w:rPr>
+        <w:br/>
+      </w:r>
+      <w:r>
+        <w:rPr>
+          <w:rFonts w:ascii="JetBrains Mono" w:eastAsia="Times New Roman" w:hAnsi="JetBrains Mono" w:cs="Courier New"/>
+          <w:color w:val="ED864A"/>
+          <w:kern w:val="0"/>
+          <w:sz w:val="16"/>
+          <w:szCs w:val="16"/>
+          <w14:ligatures w14:val="none"/>
+        </w:rPr>
+        <w:br/>
+        <w:t xml:space="preserve">    </w:t>
+      </w:r>
+      <w:r>
+        <w:rPr>
+          <w:rFonts w:ascii="JetBrains Mono" w:eastAsia="Times New Roman" w:hAnsi="JetBrains Mono" w:cs="Courier New"/>
+          <w:color w:val="8888C6"/>
+          <w:kern w:val="0"/>
+          <w:sz w:val="16"/>
+          <w:szCs w:val="16"/>
+          <w14:ligatures w14:val="none"/>
+        </w:rPr>
+        <w:t>print</w:t>
+      </w:r>
+      <w:r>
+        <w:rPr>
+          <w:rFonts w:ascii="JetBrains Mono" w:eastAsia="Times New Roman" w:hAnsi="JetBrains Mono" w:cs="Courier New"/>
+          <w:color w:val="EBEBEB"/>
+          <w:kern w:val="0"/>
+          <w:sz w:val="16"/>
+          <w:szCs w:val="16"/>
+          <w14:ligatures w14:val="none"/>
+        </w:rPr>
+        <w:t>(</w:t>
+      </w:r>
+      <w:r>
+        <w:rPr>
+          <w:rFonts w:ascii="JetBrains Mono" w:eastAsia="Times New Roman" w:hAnsi="JetBrains Mono" w:cs="Courier New"/>
+          <w:color w:val="54B33E"/>
+          <w:kern w:val="0"/>
+          <w:sz w:val="16"/>
+          <w:szCs w:val="16"/>
+          <w14:ligatures w14:val="none"/>
+        </w:rPr>
+        <w:t>"Changes detected:"</w:t>
+      </w:r>
+      <w:r>
+        <w:rPr>
+          <w:rFonts w:ascii="JetBrains Mono" w:eastAsia="Times New Roman" w:hAnsi="JetBrains Mono" w:cs="Courier New"/>
+          <w:color w:val="EBEBEB"/>
+          <w:kern w:val="0"/>
+          <w:sz w:val="16"/>
+          <w:szCs w:val="16"/>
+          <w14:ligatures w14:val="none"/>
+        </w:rPr>
+        <w:t>)</w:t>
+      </w:r>
+      <w:r>
+        <w:rPr>
+          <w:rFonts w:ascii="JetBrains Mono" w:eastAsia="Times New Roman" w:hAnsi="JetBrains Mono" w:cs="Courier New"/>
+          <w:color w:val="EBEBEB"/>
+          <w:kern w:val="0"/>
+          <w:sz w:val="16"/>
+          <w:szCs w:val="16"/>
+          <w14:ligatures w14:val="none"/>
+        </w:rPr>
+        <w:br/>
+        <w:t xml:space="preserve">    </w:t>
+      </w:r>
+      <w:r>
+        <w:rPr>
+          <w:rFonts w:ascii="JetBrains Mono" w:eastAsia="Times New Roman" w:hAnsi="JetBrains Mono" w:cs="Courier New"/>
+          <w:color w:val="8888C6"/>
+          <w:kern w:val="0"/>
+          <w:sz w:val="16"/>
+          <w:szCs w:val="16"/>
+          <w14:ligatures w14:val="none"/>
+        </w:rPr>
+        <w:t>print</w:t>
+      </w:r>
+      <w:r>
+        <w:rPr>
+          <w:rFonts w:ascii="JetBrains Mono" w:eastAsia="Times New Roman" w:hAnsi="JetBrains Mono" w:cs="Courier New"/>
+          <w:color w:val="EBEBEB"/>
+          <w:kern w:val="0"/>
+          <w:sz w:val="16"/>
+          <w:szCs w:val="16"/>
+          <w14:ligatures w14:val="none"/>
+        </w:rPr>
+        <w:t>(run(</w:t>
+      </w:r>
+      <w:r>
+        <w:rPr>
+          <w:rFonts w:ascii="JetBrains Mono" w:eastAsia="Times New Roman" w:hAnsi="JetBrains Mono" w:cs="Courier New"/>
+          <w:color w:val="54B33E"/>
+          <w:kern w:val="0"/>
+          <w:sz w:val="16"/>
+          <w:szCs w:val="16"/>
+          <w14:ligatures w14:val="none"/>
+        </w:rPr>
+        <w:t>"git status"</w:t>
+      </w:r>
+      <w:r>
+        <w:rPr>
+          <w:rFonts w:ascii="JetBrains Mono" w:eastAsia="Times New Roman" w:hAnsi="JetBrains Mono" w:cs="Courier New"/>
+          <w:b/>
+          <w:bCs/>
+          <w:color w:val="ED864A"/>
+          <w:kern w:val="0"/>
+          <w:sz w:val="16"/>
+          <w:szCs w:val="16"/>
+          <w14:ligatures w14:val="none"/>
+        </w:rPr>
+        <w:t xml:space="preserve">, </w:t>
+      </w:r>
+      <w:r>
+        <w:rPr>
+          <w:rFonts w:ascii="JetBrains Mono" w:eastAsia="Times New Roman" w:hAnsi="JetBrains Mono" w:cs="Courier New"/>
+          <w:color w:val="FFFFFF"/>
+          <w:kern w:val="0"/>
+          <w:sz w:val="16"/>
+          <w:szCs w:val="16"/>
+          <w14:ligatures w14:val="none"/>
+        </w:rPr>
+        <w:t>path</w:t>
+      </w:r>
+      <w:r>
+        <w:rPr>
+          <w:rFonts w:ascii="JetBrains Mono" w:eastAsia="Times New Roman" w:hAnsi="JetBrains Mono" w:cs="Courier New"/>
+          <w:color w:val="EBEBEB"/>
+          <w:kern w:val="0"/>
+          <w:sz w:val="16"/>
+          <w:szCs w:val="16"/>
+          <w14:ligatures w14:val="none"/>
+        </w:rPr>
+        <w:t>))</w:t>
+      </w:r>
+      <w:r>
+        <w:rPr>
+          <w:rFonts w:ascii="JetBrains Mono" w:eastAsia="Times New Roman" w:hAnsi="JetBrains Mono" w:cs="Courier New"/>
+          <w:color w:val="EBEBEB"/>
+          <w:kern w:val="0"/>
+          <w:sz w:val="16"/>
+          <w:szCs w:val="16"/>
+          <w14:ligatures w14:val="none"/>
+        </w:rPr>
+        <w:br/>
+      </w:r>
+      <w:r>
+        <w:rPr>
+          <w:rFonts w:ascii="JetBrains Mono" w:eastAsia="Times New Roman" w:hAnsi="JetBrains Mono" w:cs="Courier New"/>
+          <w:color w:val="EBEBEB"/>
+          <w:kern w:val="0"/>
+          <w:sz w:val="16"/>
+          <w:szCs w:val="16"/>
+          <w14:ligatures w14:val="none"/>
+        </w:rPr>
+        <w:br/>
+        <w:t xml:space="preserve">    msg = </w:t>
+      </w:r>
+      <w:r>
+        <w:rPr>
+          <w:rFonts w:ascii="JetBrains Mono" w:eastAsia="Times New Roman" w:hAnsi="JetBrains Mono" w:cs="Courier New"/>
+          <w:color w:val="8888C6"/>
+          <w:kern w:val="0"/>
+          <w:sz w:val="16"/>
+          <w:szCs w:val="16"/>
+          <w14:ligatures w14:val="none"/>
+        </w:rPr>
+        <w:t>input</w:t>
+      </w:r>
+      <w:r>
+        <w:rPr>
+          <w:rFonts w:ascii="JetBrains Mono" w:eastAsia="Times New Roman" w:hAnsi="JetBrains Mono" w:cs="Courier New"/>
+          <w:color w:val="EBEBEB"/>
+          <w:kern w:val="0"/>
+          <w:sz w:val="16"/>
+          <w:szCs w:val="16"/>
+          <w14:ligatures w14:val="none"/>
+        </w:rPr>
+        <w:t>(</w:t>
+      </w:r>
+      <w:r>
+        <w:rPr>
+          <w:rFonts w:ascii="JetBrains Mono" w:eastAsia="Times New Roman" w:hAnsi="JetBrains Mono" w:cs="Courier New"/>
+          <w:color w:val="54B33E"/>
+          <w:kern w:val="0"/>
+          <w:sz w:val="16"/>
+          <w:szCs w:val="16"/>
+          <w14:ligatures w14:val="none"/>
+        </w:rPr>
+        <w:t>"Commit message (leave empty to skip): "</w:t>
+      </w:r>
+      <w:r>
+        <w:rPr>
+          <w:rFonts w:ascii="JetBrains Mono" w:eastAsia="Times New Roman" w:hAnsi="JetBrains Mono" w:cs="Courier New"/>
+          <w:color w:val="EBEBEB"/>
+          <w:kern w:val="0"/>
+          <w:sz w:val="16"/>
+          <w:szCs w:val="16"/>
+          <w14:ligatures w14:val="none"/>
+        </w:rPr>
+        <w:t>).strip()</w:t>
+      </w:r>
+      <w:r>
+        <w:rPr>
+          <w:rFonts w:ascii="JetBrains Mono" w:eastAsia="Times New Roman" w:hAnsi="JetBrains Mono" w:cs="Courier New"/>
+          <w:color w:val="EBEBEB"/>
+          <w:kern w:val="0"/>
+          <w:sz w:val="16"/>
+          <w:szCs w:val="16"/>
+          <w14:ligatures w14:val="none"/>
+        </w:rPr>
+        <w:br/>
+        <w:t xml:space="preserve">    </w:t>
+      </w:r>
+      <w:r>
+        <w:rPr>
+          <w:rFonts w:ascii="JetBrains Mono" w:eastAsia="Times New Roman" w:hAnsi="JetBrains Mono" w:cs="Courier New"/>
+          <w:color w:val="ED864A"/>
+          <w:kern w:val="0"/>
+          <w:sz w:val="16"/>
+          <w:szCs w:val="16"/>
+          <w14:ligatures w14:val="none"/>
+        </w:rPr>
+        <w:t xml:space="preserve">if not </w:t>
+      </w:r>
+      <w:r>
+        <w:rPr>
+          <w:rFonts w:ascii="JetBrains Mono" w:eastAsia="Times New Roman" w:hAnsi="JetBrains Mono" w:cs="Courier New"/>
+          <w:color w:val="EBEBEB"/>
+          <w:kern w:val="0"/>
+          <w:sz w:val="16"/>
+          <w:szCs w:val="16"/>
+          <w14:ligatures w14:val="none"/>
+        </w:rPr>
+        <w:t>msg:</w:t>
+      </w:r>
+      <w:r>
+        <w:rPr>
+          <w:rFonts w:ascii="JetBrains Mono" w:eastAsia="Times New Roman" w:hAnsi="JetBrains Mono" w:cs="Courier New"/>
+          <w:color w:val="EBEBEB"/>
+          <w:kern w:val="0"/>
+          <w:sz w:val="16"/>
+          <w:szCs w:val="16"/>
+          <w14:ligatures w14:val="none"/>
+        </w:rPr>
+        <w:br/>
+        <w:t xml:space="preserve">        </w:t>
+      </w:r>
+      <w:r>
+        <w:rPr>
+          <w:rFonts w:ascii="JetBrains Mono" w:eastAsia="Times New Roman" w:hAnsi="JetBrains Mono" w:cs="Courier New"/>
+          <w:color w:val="8888C6"/>
+          <w:kern w:val="0"/>
+          <w:sz w:val="16"/>
+          <w:szCs w:val="16"/>
+          <w14:ligatures w14:val="none"/>
+        </w:rPr>
+        <w:t>print</w:t>
+      </w:r>
+      <w:r>
+        <w:rPr>
+          <w:rFonts w:ascii="JetBrains Mono" w:eastAsia="Times New Roman" w:hAnsi="JetBrains Mono" w:cs="Courier New"/>
+          <w:color w:val="EBEBEB"/>
+          <w:kern w:val="0"/>
+          <w:sz w:val="16"/>
+          <w:szCs w:val="16"/>
+          <w14:ligatures w14:val="none"/>
+        </w:rPr>
+        <w:t>(</w:t>
+      </w:r>
+      <w:r>
+        <w:rPr>
+          <w:rFonts w:ascii="JetBrains Mono" w:eastAsia="Times New Roman" w:hAnsi="JetBrains Mono" w:cs="Courier New"/>
+          <w:color w:val="54B33E"/>
+          <w:kern w:val="0"/>
+          <w:sz w:val="16"/>
+          <w:szCs w:val="16"/>
+          <w14:ligatures w14:val="none"/>
+        </w:rPr>
+        <w:t>"Skipping commit for this repo."</w:t>
+      </w:r>
+      <w:r>
+        <w:rPr>
+          <w:rFonts w:ascii="JetBrains Mono" w:eastAsia="Times New Roman" w:hAnsi="JetBrains Mono" w:cs="Courier New"/>
+          <w:color w:val="EBEBEB"/>
+          <w:kern w:val="0"/>
+          <w:sz w:val="16"/>
+          <w:szCs w:val="16"/>
+          <w14:ligatures w14:val="none"/>
+        </w:rPr>
+        <w:t>)</w:t>
+      </w:r>
+      <w:r>
+        <w:rPr>
+          <w:rFonts w:ascii="JetBrains Mono" w:eastAsia="Times New Roman" w:hAnsi="JetBrains Mono" w:cs="Courier New"/>
+          <w:color w:val="EBEBEB"/>
+          <w:kern w:val="0"/>
+          <w:sz w:val="16"/>
+          <w:szCs w:val="16"/>
+          <w14:ligatures w14:val="none"/>
+        </w:rPr>
+        <w:br/>
+        <w:t xml:space="preserve">        </w:t>
+      </w:r>
+      <w:r>
+        <w:rPr>
+          <w:rFonts w:ascii="JetBrains Mono" w:eastAsia="Times New Roman" w:hAnsi="JetBrains Mono" w:cs="Courier New"/>
+          <w:color w:val="ED864A"/>
+          <w:kern w:val="0"/>
+          <w:sz w:val="16"/>
+          <w:szCs w:val="16"/>
+          <w14:ligatures w14:val="none"/>
+        </w:rPr>
+        <w:t>return</w:t>
+      </w:r>
+      <w:r>
+        <w:rPr>
+          <w:rFonts w:ascii="JetBrains Mono" w:eastAsia="Times New Roman" w:hAnsi="JetBrains Mono" w:cs="Courier New"/>
+          <w:color w:val="ED864A"/>
+          <w:kern w:val="0"/>
+          <w:sz w:val="16"/>
+          <w:szCs w:val="16"/>
+          <w14:ligatures w14:val="none"/>
+        </w:rPr>
+        <w:br/>
+      </w:r>
+      <w:r>
+        <w:rPr>
+          <w:rFonts w:ascii="JetBrains Mono" w:eastAsia="Times New Roman" w:hAnsi="JetBrains Mono" w:cs="Courier New"/>
+          <w:color w:val="ED864A"/>
+          <w:kern w:val="0"/>
+          <w:sz w:val="16"/>
+          <w:szCs w:val="16"/>
+          <w14:ligatures w14:val="none"/>
+        </w:rPr>
+        <w:br/>
+        <w:t xml:space="preserve">    </w:t>
+      </w:r>
+      <w:r>
+        <w:rPr>
+          <w:rFonts w:ascii="JetBrains Mono" w:eastAsia="Times New Roman" w:hAnsi="JetBrains Mono" w:cs="Courier New"/>
+          <w:color w:val="7EC3E6"/>
+          <w:kern w:val="0"/>
+          <w:sz w:val="16"/>
+          <w:szCs w:val="16"/>
+          <w14:ligatures w14:val="none"/>
+        </w:rPr>
+        <w:t># Commit and push</w:t>
+      </w:r>
+      <w:r>
+        <w:rPr>
+          <w:rFonts w:ascii="JetBrains Mono" w:eastAsia="Times New Roman" w:hAnsi="JetBrains Mono" w:cs="Courier New"/>
+          <w:color w:val="7EC3E6"/>
+          <w:kern w:val="0"/>
+          <w:sz w:val="16"/>
+          <w:szCs w:val="16"/>
+          <w14:ligatures w14:val="none"/>
+        </w:rPr>
+        <w:br/>
+        <w:t xml:space="preserve">    </w:t>
+      </w:r>
+      <w:r>
+        <w:rPr>
+          <w:rFonts w:ascii="JetBrains Mono" w:eastAsia="Times New Roman" w:hAnsi="JetBrains Mono" w:cs="Courier New"/>
+          <w:color w:val="8888C6"/>
+          <w:kern w:val="0"/>
+          <w:sz w:val="16"/>
+          <w:szCs w:val="16"/>
+          <w14:ligatures w14:val="none"/>
+        </w:rPr>
+        <w:t>print</w:t>
+      </w:r>
+      <w:r>
+        <w:rPr>
+          <w:rFonts w:ascii="JetBrains Mono" w:eastAsia="Times New Roman" w:hAnsi="JetBrains Mono" w:cs="Courier New"/>
+          <w:color w:val="EBEBEB"/>
+          <w:kern w:val="0"/>
+          <w:sz w:val="16"/>
+          <w:szCs w:val="16"/>
+          <w14:ligatures w14:val="none"/>
+        </w:rPr>
+        <w:t>(</w:t>
+      </w:r>
+      <w:r>
+        <w:rPr>
+          <w:rFonts w:ascii="JetBrains Mono" w:eastAsia="Times New Roman" w:hAnsi="JetBrains Mono" w:cs="Courier New"/>
+          <w:color w:val="54B33E"/>
+          <w:kern w:val="0"/>
+          <w:sz w:val="16"/>
+          <w:szCs w:val="16"/>
+          <w14:ligatures w14:val="none"/>
+        </w:rPr>
+        <w:t xml:space="preserve">f"...Updating the repo: </w:t>
+      </w:r>
+      <w:r>
+        <w:rPr>
+          <w:rFonts w:ascii="JetBrains Mono" w:eastAsia="Times New Roman" w:hAnsi="JetBrains Mono" w:cs="Courier New"/>
+          <w:color w:val="ED864A"/>
+          <w:kern w:val="0"/>
+          <w:sz w:val="16"/>
+          <w:szCs w:val="16"/>
+          <w14:ligatures w14:val="none"/>
+        </w:rPr>
+        <w:t>{</w:t>
+      </w:r>
+      <w:r>
+        <w:rPr>
+          <w:rFonts w:ascii="JetBrains Mono" w:eastAsia="Times New Roman" w:hAnsi="JetBrains Mono" w:cs="Courier New"/>
+          <w:color w:val="FFFFFF"/>
+          <w:kern w:val="0"/>
+          <w:sz w:val="16"/>
+          <w:szCs w:val="16"/>
+          <w14:ligatures w14:val="none"/>
+        </w:rPr>
+        <w:t>path</w:t>
+      </w:r>
+      <w:r>
+        <w:rPr>
+          <w:rFonts w:ascii="JetBrains Mono" w:eastAsia="Times New Roman" w:hAnsi="JetBrains Mono" w:cs="Courier New"/>
+          <w:color w:val="ED864A"/>
+          <w:kern w:val="0"/>
+          <w:sz w:val="16"/>
+          <w:szCs w:val="16"/>
+          <w14:ligatures w14:val="none"/>
+        </w:rPr>
+        <w:t>}</w:t>
+      </w:r>
+      <w:r>
+        <w:rPr>
+          <w:rFonts w:ascii="JetBrains Mono" w:eastAsia="Times New Roman" w:hAnsi="JetBrains Mono" w:cs="Courier New"/>
+          <w:color w:val="54B33E"/>
+          <w:kern w:val="0"/>
+          <w:sz w:val="16"/>
+          <w:szCs w:val="16"/>
+          <w14:ligatures w14:val="none"/>
+        </w:rPr>
+        <w:t>"</w:t>
+      </w:r>
+      <w:r>
+        <w:rPr>
+          <w:rFonts w:ascii="JetBrains Mono" w:eastAsia="Times New Roman" w:hAnsi="JetBrains Mono" w:cs="Courier New"/>
+          <w:color w:val="EBEBEB"/>
+          <w:kern w:val="0"/>
+          <w:sz w:val="16"/>
+          <w:szCs w:val="16"/>
+          <w14:ligatures w14:val="none"/>
+        </w:rPr>
+        <w:t>)</w:t>
+      </w:r>
+      <w:r>
+        <w:rPr>
+          <w:rFonts w:ascii="JetBrains Mono" w:eastAsia="Times New Roman" w:hAnsi="JetBrains Mono" w:cs="Courier New"/>
+          <w:color w:val="EBEBEB"/>
+          <w:kern w:val="0"/>
+          <w:sz w:val="16"/>
+          <w:szCs w:val="16"/>
+          <w14:ligatures w14:val="none"/>
+        </w:rPr>
+        <w:br/>
+        <w:t xml:space="preserve">    run(</w:t>
+      </w:r>
+      <w:r>
+        <w:rPr>
+          <w:rFonts w:ascii="JetBrains Mono" w:eastAsia="Times New Roman" w:hAnsi="JetBrains Mono" w:cs="Courier New"/>
+          <w:color w:val="54B33E"/>
+          <w:kern w:val="0"/>
+          <w:sz w:val="16"/>
+          <w:szCs w:val="16"/>
+          <w14:ligatures w14:val="none"/>
+        </w:rPr>
+        <w:t>"git add ."</w:t>
+      </w:r>
+      <w:r>
+        <w:rPr>
+          <w:rFonts w:ascii="JetBrains Mono" w:eastAsia="Times New Roman" w:hAnsi="JetBrains Mono" w:cs="Courier New"/>
+          <w:b/>
+          <w:bCs/>
+          <w:color w:val="ED864A"/>
+          <w:kern w:val="0"/>
+          <w:sz w:val="16"/>
+          <w:szCs w:val="16"/>
+          <w14:ligatures w14:val="none"/>
+        </w:rPr>
+        <w:t xml:space="preserve">, </w:t>
+      </w:r>
+      <w:r>
+        <w:rPr>
+          <w:rFonts w:ascii="JetBrains Mono" w:eastAsia="Times New Roman" w:hAnsi="JetBrains Mono" w:cs="Courier New"/>
+          <w:color w:val="FFFFFF"/>
+          <w:kern w:val="0"/>
+          <w:sz w:val="16"/>
+          <w:szCs w:val="16"/>
+          <w14:ligatures w14:val="none"/>
+        </w:rPr>
+        <w:t>path</w:t>
+      </w:r>
+      <w:r>
+        <w:rPr>
+          <w:rFonts w:ascii="JetBrains Mono" w:eastAsia="Times New Roman" w:hAnsi="JetBrains Mono" w:cs="Courier New"/>
+          <w:color w:val="EBEBEB"/>
+          <w:kern w:val="0"/>
+          <w:sz w:val="16"/>
+          <w:szCs w:val="16"/>
+          <w14:ligatures w14:val="none"/>
+        </w:rPr>
+        <w:t>)</w:t>
+      </w:r>
+      <w:r>
+        <w:rPr>
+          <w:rFonts w:ascii="JetBrains Mono" w:eastAsia="Times New Roman" w:hAnsi="JetBrains Mono" w:cs="Courier New"/>
+          <w:color w:val="EBEBEB"/>
+          <w:kern w:val="0"/>
+          <w:sz w:val="16"/>
+          <w:szCs w:val="16"/>
+          <w14:ligatures w14:val="none"/>
+        </w:rPr>
+        <w:br/>
+        <w:t xml:space="preserve">    </w:t>
+      </w:r>
+      <w:r>
+        <w:rPr>
+          <w:rFonts w:ascii="JetBrains Mono" w:eastAsia="Times New Roman" w:hAnsi="JetBrains Mono" w:cs="Courier New"/>
+          <w:color w:val="7EC3E6"/>
+          <w:kern w:val="0"/>
+          <w:sz w:val="16"/>
+          <w:szCs w:val="16"/>
+          <w14:ligatures w14:val="none"/>
+        </w:rPr>
+        <w:t>#run(f'git commit -m "{msg}"', path)</w:t>
+      </w:r>
+      <w:r>
+        <w:rPr>
+          <w:rFonts w:ascii="JetBrains Mono" w:eastAsia="Times New Roman" w:hAnsi="JetBrains Mono" w:cs="Courier New"/>
+          <w:color w:val="7EC3E6"/>
+          <w:kern w:val="0"/>
+          <w:sz w:val="16"/>
+          <w:szCs w:val="16"/>
+          <w14:ligatures w14:val="none"/>
+        </w:rPr>
+        <w:br/>
+        <w:t xml:space="preserve">    </w:t>
+      </w:r>
+      <w:proofErr w:type="spellStart"/>
+      <w:r>
+        <w:rPr>
+          <w:rFonts w:ascii="JetBrains Mono" w:eastAsia="Times New Roman" w:hAnsi="JetBrains Mono" w:cs="Courier New"/>
+          <w:color w:val="EBEBEB"/>
+          <w:kern w:val="0"/>
+          <w:sz w:val="16"/>
+          <w:szCs w:val="16"/>
+          <w14:ligatures w14:val="none"/>
+        </w:rPr>
+        <w:t>subprocess.run</w:t>
+      </w:r>
+      <w:proofErr w:type="spellEnd"/>
+      <w:r>
+        <w:rPr>
+          <w:rFonts w:ascii="JetBrains Mono" w:eastAsia="Times New Roman" w:hAnsi="JetBrains Mono" w:cs="Courier New"/>
+          <w:color w:val="EBEBEB"/>
+          <w:kern w:val="0"/>
+          <w:sz w:val="16"/>
+          <w:szCs w:val="16"/>
+          <w14:ligatures w14:val="none"/>
+        </w:rPr>
+        <w:t>([</w:t>
+      </w:r>
+      <w:r>
+        <w:rPr>
+          <w:rFonts w:ascii="JetBrains Mono" w:eastAsia="Times New Roman" w:hAnsi="JetBrains Mono" w:cs="Courier New"/>
+          <w:color w:val="54B33E"/>
+          <w:kern w:val="0"/>
+          <w:sz w:val="16"/>
+          <w:szCs w:val="16"/>
+          <w14:ligatures w14:val="none"/>
+        </w:rPr>
+        <w:t>"git"</w:t>
+      </w:r>
+      <w:r>
+        <w:rPr>
+          <w:rFonts w:ascii="JetBrains Mono" w:eastAsia="Times New Roman" w:hAnsi="JetBrains Mono" w:cs="Courier New"/>
+          <w:b/>
+          <w:bCs/>
+          <w:color w:val="ED864A"/>
+          <w:kern w:val="0"/>
+          <w:sz w:val="16"/>
+          <w:szCs w:val="16"/>
+          <w14:ligatures w14:val="none"/>
+        </w:rPr>
+        <w:t xml:space="preserve">, </w:t>
+      </w:r>
+      <w:r>
+        <w:rPr>
+          <w:rFonts w:ascii="JetBrains Mono" w:eastAsia="Times New Roman" w:hAnsi="JetBrains Mono" w:cs="Courier New"/>
+          <w:color w:val="54B33E"/>
+          <w:kern w:val="0"/>
+          <w:sz w:val="16"/>
+          <w:szCs w:val="16"/>
+          <w14:ligatures w14:val="none"/>
+        </w:rPr>
+        <w:t>"commit"</w:t>
+      </w:r>
+      <w:r>
+        <w:rPr>
+          <w:rFonts w:ascii="JetBrains Mono" w:eastAsia="Times New Roman" w:hAnsi="JetBrains Mono" w:cs="Courier New"/>
+          <w:b/>
+          <w:bCs/>
+          <w:color w:val="ED864A"/>
+          <w:kern w:val="0"/>
+          <w:sz w:val="16"/>
+          <w:szCs w:val="16"/>
+          <w14:ligatures w14:val="none"/>
+        </w:rPr>
+        <w:t xml:space="preserve">, </w:t>
+      </w:r>
+      <w:r>
+        <w:rPr>
+          <w:rFonts w:ascii="JetBrains Mono" w:eastAsia="Times New Roman" w:hAnsi="JetBrains Mono" w:cs="Courier New"/>
+          <w:color w:val="54B33E"/>
+          <w:kern w:val="0"/>
+          <w:sz w:val="16"/>
+          <w:szCs w:val="16"/>
+          <w14:ligatures w14:val="none"/>
+        </w:rPr>
+        <w:t>"-m"</w:t>
+      </w:r>
+      <w:r>
+        <w:rPr>
+          <w:rFonts w:ascii="JetBrains Mono" w:eastAsia="Times New Roman" w:hAnsi="JetBrains Mono" w:cs="Courier New"/>
+          <w:b/>
+          <w:bCs/>
+          <w:color w:val="ED864A"/>
+          <w:kern w:val="0"/>
+          <w:sz w:val="16"/>
+          <w:szCs w:val="16"/>
+          <w14:ligatures w14:val="none"/>
+        </w:rPr>
+        <w:t xml:space="preserve">, </w:t>
+      </w:r>
+      <w:r>
+        <w:rPr>
+          <w:rFonts w:ascii="JetBrains Mono" w:eastAsia="Times New Roman" w:hAnsi="JetBrains Mono" w:cs="Courier New"/>
+          <w:color w:val="EBEBEB"/>
+          <w:kern w:val="0"/>
+          <w:sz w:val="16"/>
+          <w:szCs w:val="16"/>
+          <w14:ligatures w14:val="none"/>
+        </w:rPr>
+        <w:t>msg]</w:t>
+      </w:r>
+      <w:r>
+        <w:rPr>
+          <w:rFonts w:ascii="JetBrains Mono" w:eastAsia="Times New Roman" w:hAnsi="JetBrains Mono" w:cs="Courier New"/>
+          <w:b/>
+          <w:bCs/>
+          <w:color w:val="ED864A"/>
+          <w:kern w:val="0"/>
+          <w:sz w:val="16"/>
+          <w:szCs w:val="16"/>
+          <w14:ligatures w14:val="none"/>
+        </w:rPr>
+        <w:t xml:space="preserve">, </w:t>
+      </w:r>
+      <w:proofErr w:type="spellStart"/>
+      <w:r>
+        <w:rPr>
+          <w:rFonts w:ascii="JetBrains Mono" w:eastAsia="Times New Roman" w:hAnsi="JetBrains Mono" w:cs="Courier New"/>
+          <w:color w:val="AA4926"/>
+          <w:kern w:val="0"/>
+          <w:sz w:val="16"/>
+          <w:szCs w:val="16"/>
+          <w14:ligatures w14:val="none"/>
+        </w:rPr>
+        <w:t>cwd</w:t>
+      </w:r>
+      <w:proofErr w:type="spellEnd"/>
+      <w:r>
+        <w:rPr>
+          <w:rFonts w:ascii="JetBrains Mono" w:eastAsia="Times New Roman" w:hAnsi="JetBrains Mono" w:cs="Courier New"/>
+          <w:color w:val="EBEBEB"/>
+          <w:kern w:val="0"/>
+          <w:sz w:val="16"/>
+          <w:szCs w:val="16"/>
+          <w14:ligatures w14:val="none"/>
+        </w:rPr>
+        <w:t>=</w:t>
+      </w:r>
+      <w:r>
+        <w:rPr>
+          <w:rFonts w:ascii="JetBrains Mono" w:eastAsia="Times New Roman" w:hAnsi="JetBrains Mono" w:cs="Courier New"/>
+          <w:color w:val="FFFFFF"/>
+          <w:kern w:val="0"/>
+          <w:sz w:val="16"/>
+          <w:szCs w:val="16"/>
+          <w14:ligatures w14:val="none"/>
+        </w:rPr>
+        <w:t>path</w:t>
+      </w:r>
+      <w:r>
+        <w:rPr>
+          <w:rFonts w:ascii="JetBrains Mono" w:eastAsia="Times New Roman" w:hAnsi="JetBrains Mono" w:cs="Courier New"/>
+          <w:color w:val="EBEBEB"/>
+          <w:kern w:val="0"/>
+          <w:sz w:val="16"/>
+          <w:szCs w:val="16"/>
+          <w14:ligatures w14:val="none"/>
+        </w:rPr>
+        <w:t>)</w:t>
+      </w:r>
+      <w:r>
+        <w:rPr>
+          <w:rFonts w:ascii="JetBrains Mono" w:eastAsia="Times New Roman" w:hAnsi="JetBrains Mono" w:cs="Courier New"/>
+          <w:color w:val="EBEBEB"/>
+          <w:kern w:val="0"/>
+          <w:sz w:val="16"/>
+          <w:szCs w:val="16"/>
+          <w14:ligatures w14:val="none"/>
+        </w:rPr>
+        <w:br/>
+        <w:t xml:space="preserve">    </w:t>
+      </w:r>
+      <w:r>
+        <w:rPr>
+          <w:rFonts w:ascii="JetBrains Mono" w:eastAsia="Times New Roman" w:hAnsi="JetBrains Mono" w:cs="Courier New"/>
+          <w:color w:val="8888C6"/>
+          <w:kern w:val="0"/>
+          <w:sz w:val="16"/>
+          <w:szCs w:val="16"/>
+          <w14:ligatures w14:val="none"/>
+        </w:rPr>
+        <w:t>print</w:t>
+      </w:r>
+      <w:r>
+        <w:rPr>
+          <w:rFonts w:ascii="JetBrains Mono" w:eastAsia="Times New Roman" w:hAnsi="JetBrains Mono" w:cs="Courier New"/>
+          <w:color w:val="EBEBEB"/>
+          <w:kern w:val="0"/>
+          <w:sz w:val="16"/>
+          <w:szCs w:val="16"/>
+          <w14:ligatures w14:val="none"/>
+        </w:rPr>
+        <w:t>(run(</w:t>
+      </w:r>
+      <w:r>
+        <w:rPr>
+          <w:rFonts w:ascii="JetBrains Mono" w:eastAsia="Times New Roman" w:hAnsi="JetBrains Mono" w:cs="Courier New"/>
+          <w:color w:val="54B33E"/>
+          <w:kern w:val="0"/>
+          <w:sz w:val="16"/>
+          <w:szCs w:val="16"/>
+          <w14:ligatures w14:val="none"/>
+        </w:rPr>
+        <w:t>"git push"</w:t>
+      </w:r>
+      <w:r>
+        <w:rPr>
+          <w:rFonts w:ascii="JetBrains Mono" w:eastAsia="Times New Roman" w:hAnsi="JetBrains Mono" w:cs="Courier New"/>
+          <w:b/>
+          <w:bCs/>
+          <w:color w:val="ED864A"/>
+          <w:kern w:val="0"/>
+          <w:sz w:val="16"/>
+          <w:szCs w:val="16"/>
+          <w14:ligatures w14:val="none"/>
+        </w:rPr>
+        <w:t xml:space="preserve">, </w:t>
+      </w:r>
+      <w:r>
+        <w:rPr>
+          <w:rFonts w:ascii="JetBrains Mono" w:eastAsia="Times New Roman" w:hAnsi="JetBrains Mono" w:cs="Courier New"/>
+          <w:color w:val="FFFFFF"/>
+          <w:kern w:val="0"/>
+          <w:sz w:val="16"/>
+          <w:szCs w:val="16"/>
+          <w14:ligatures w14:val="none"/>
+        </w:rPr>
+        <w:t>path</w:t>
+      </w:r>
+      <w:r>
+        <w:rPr>
+          <w:rFonts w:ascii="JetBrains Mono" w:eastAsia="Times New Roman" w:hAnsi="JetBrains Mono" w:cs="Courier New"/>
+          <w:color w:val="EBEBEB"/>
+          <w:kern w:val="0"/>
+          <w:sz w:val="16"/>
+          <w:szCs w:val="16"/>
+          <w14:ligatures w14:val="none"/>
+        </w:rPr>
+        <w:t>))</w:t>
+      </w:r>
+      <w:r>
+        <w:rPr>
+          <w:rFonts w:ascii="JetBrains Mono" w:eastAsia="Times New Roman" w:hAnsi="JetBrains Mono" w:cs="Courier New"/>
+          <w:color w:val="EBEBEB"/>
+          <w:kern w:val="0"/>
+          <w:sz w:val="16"/>
+          <w:szCs w:val="16"/>
+          <w14:ligatures w14:val="none"/>
+        </w:rPr>
+        <w:br/>
+      </w:r>
+      <w:r>
+        <w:rPr>
+          <w:rFonts w:ascii="JetBrains Mono" w:eastAsia="Times New Roman" w:hAnsi="JetBrains Mono" w:cs="Courier New"/>
+          <w:color w:val="EBEBEB"/>
+          <w:kern w:val="0"/>
+          <w:sz w:val="16"/>
+          <w:szCs w:val="16"/>
+          <w14:ligatures w14:val="none"/>
+        </w:rPr>
+        <w:br/>
+        <w:t xml:space="preserve">    </w:t>
+      </w:r>
+      <w:r>
+        <w:rPr>
+          <w:rFonts w:ascii="JetBrains Mono" w:eastAsia="Times New Roman" w:hAnsi="JetBrains Mono" w:cs="Courier New"/>
+          <w:color w:val="8888C6"/>
+          <w:kern w:val="0"/>
+          <w:sz w:val="16"/>
+          <w:szCs w:val="16"/>
+          <w14:ligatures w14:val="none"/>
+        </w:rPr>
+        <w:t>print</w:t>
+      </w:r>
+      <w:r>
+        <w:rPr>
+          <w:rFonts w:ascii="JetBrains Mono" w:eastAsia="Times New Roman" w:hAnsi="JetBrains Mono" w:cs="Courier New"/>
+          <w:color w:val="EBEBEB"/>
+          <w:kern w:val="0"/>
+          <w:sz w:val="16"/>
+          <w:szCs w:val="16"/>
+          <w14:ligatures w14:val="none"/>
+        </w:rPr>
+        <w:t>(</w:t>
+      </w:r>
+      <w:r>
+        <w:rPr>
+          <w:rFonts w:ascii="JetBrains Mono" w:eastAsia="Times New Roman" w:hAnsi="JetBrains Mono" w:cs="Courier New"/>
+          <w:color w:val="54B33E"/>
+          <w:kern w:val="0"/>
+          <w:sz w:val="16"/>
+          <w:szCs w:val="16"/>
+          <w14:ligatures w14:val="none"/>
+        </w:rPr>
+        <w:t>"Updated successfully."</w:t>
+      </w:r>
+      <w:r>
+        <w:rPr>
+          <w:rFonts w:ascii="JetBrains Mono" w:eastAsia="Times New Roman" w:hAnsi="JetBrains Mono" w:cs="Courier New"/>
+          <w:color w:val="EBEBEB"/>
+          <w:kern w:val="0"/>
+          <w:sz w:val="16"/>
+          <w:szCs w:val="16"/>
+          <w14:ligatures w14:val="none"/>
+        </w:rPr>
+        <w:t>)</w:t>
+      </w:r>
+      <w:r>
+        <w:rPr>
+          <w:rFonts w:ascii="JetBrains Mono" w:eastAsia="Times New Roman" w:hAnsi="JetBrains Mono" w:cs="Courier New"/>
+          <w:color w:val="EBEBEB"/>
+          <w:kern w:val="0"/>
+          <w:sz w:val="16"/>
+          <w:szCs w:val="16"/>
+          <w14:ligatures w14:val="none"/>
+        </w:rPr>
+        <w:br/>
+      </w:r>
+      <w:r>
+        <w:rPr>
+          <w:rFonts w:ascii="JetBrains Mono" w:eastAsia="Times New Roman" w:hAnsi="JetBrains Mono" w:cs="Courier New"/>
+          <w:color w:val="EBEBEB"/>
+          <w:kern w:val="0"/>
+          <w:sz w:val="16"/>
+          <w:szCs w:val="16"/>
+          <w14:ligatures w14:val="none"/>
+        </w:rPr>
+        <w:br/>
+      </w:r>
+      <w:r>
+        <w:rPr>
+          <w:rFonts w:ascii="JetBrains Mono" w:eastAsia="Times New Roman" w:hAnsi="JetBrains Mono" w:cs="Courier New"/>
+          <w:color w:val="EBEBEB"/>
+          <w:kern w:val="0"/>
+          <w:sz w:val="16"/>
+          <w:szCs w:val="16"/>
+          <w14:ligatures w14:val="none"/>
+        </w:rPr>
+        <w:br/>
+      </w:r>
+      <w:r>
+        <w:rPr>
+          <w:rFonts w:ascii="JetBrains Mono" w:eastAsia="Times New Roman" w:hAnsi="JetBrains Mono" w:cs="Courier New"/>
+          <w:color w:val="ED864A"/>
+          <w:kern w:val="0"/>
+          <w:sz w:val="16"/>
+          <w:szCs w:val="16"/>
+          <w14:ligatures w14:val="none"/>
+        </w:rPr>
+        <w:t xml:space="preserve">def </w:t>
+      </w:r>
+      <w:r>
+        <w:rPr>
+          <w:rFonts w:ascii="JetBrains Mono" w:eastAsia="Times New Roman" w:hAnsi="JetBrains Mono" w:cs="Courier New"/>
+          <w:color w:val="FFCF40"/>
+          <w:kern w:val="0"/>
+          <w:sz w:val="16"/>
+          <w:szCs w:val="16"/>
+          <w14:ligatures w14:val="none"/>
+        </w:rPr>
+        <w:t>main</w:t>
+      </w:r>
+      <w:r>
+        <w:rPr>
+          <w:rFonts w:ascii="JetBrains Mono" w:eastAsia="Times New Roman" w:hAnsi="JetBrains Mono" w:cs="Courier New"/>
+          <w:color w:val="EBEBEB"/>
+          <w:kern w:val="0"/>
+          <w:sz w:val="16"/>
+          <w:szCs w:val="16"/>
+          <w14:ligatures w14:val="none"/>
+        </w:rPr>
+        <w:t>():</w:t>
+      </w:r>
+      <w:r>
+        <w:rPr>
+          <w:rFonts w:ascii="JetBrains Mono" w:eastAsia="Times New Roman" w:hAnsi="JetBrains Mono" w:cs="Courier New"/>
+          <w:color w:val="EBEBEB"/>
+          <w:kern w:val="0"/>
+          <w:sz w:val="16"/>
+          <w:szCs w:val="16"/>
+          <w14:ligatures w14:val="none"/>
+        </w:rPr>
+        <w:br/>
+        <w:t xml:space="preserve">    </w:t>
+      </w:r>
+      <w:r>
+        <w:rPr>
+          <w:rFonts w:ascii="JetBrains Mono" w:eastAsia="Times New Roman" w:hAnsi="JetBrains Mono" w:cs="Courier New"/>
+          <w:color w:val="ED864A"/>
+          <w:kern w:val="0"/>
+          <w:sz w:val="16"/>
+          <w:szCs w:val="16"/>
+          <w14:ligatures w14:val="none"/>
+        </w:rPr>
+        <w:t xml:space="preserve">for </w:t>
+      </w:r>
+      <w:r>
+        <w:rPr>
+          <w:rFonts w:ascii="JetBrains Mono" w:eastAsia="Times New Roman" w:hAnsi="JetBrains Mono" w:cs="Courier New"/>
+          <w:color w:val="EBEBEB"/>
+          <w:kern w:val="0"/>
+          <w:sz w:val="16"/>
+          <w:szCs w:val="16"/>
+          <w14:ligatures w14:val="none"/>
+        </w:rPr>
+        <w:t xml:space="preserve">repo </w:t>
+      </w:r>
+      <w:r>
+        <w:rPr>
+          <w:rFonts w:ascii="JetBrains Mono" w:eastAsia="Times New Roman" w:hAnsi="JetBrains Mono" w:cs="Courier New"/>
+          <w:color w:val="ED864A"/>
+          <w:kern w:val="0"/>
+          <w:sz w:val="16"/>
+          <w:szCs w:val="16"/>
+          <w14:ligatures w14:val="none"/>
+        </w:rPr>
+        <w:t xml:space="preserve">in </w:t>
+      </w:r>
+      <w:r>
+        <w:rPr>
+          <w:rFonts w:ascii="JetBrains Mono" w:eastAsia="Times New Roman" w:hAnsi="JetBrains Mono" w:cs="Courier New"/>
+          <w:color w:val="EBEBEB"/>
+          <w:kern w:val="0"/>
+          <w:sz w:val="16"/>
+          <w:szCs w:val="16"/>
+          <w14:ligatures w14:val="none"/>
+        </w:rPr>
+        <w:t>REPOS:</w:t>
+      </w:r>
+      <w:r>
+        <w:rPr>
+          <w:rFonts w:ascii="JetBrains Mono" w:eastAsia="Times New Roman" w:hAnsi="JetBrains Mono" w:cs="Courier New"/>
+          <w:color w:val="EBEBEB"/>
+          <w:kern w:val="0"/>
+          <w:sz w:val="16"/>
+          <w:szCs w:val="16"/>
+          <w14:ligatures w14:val="none"/>
+        </w:rPr>
+        <w:br/>
+        <w:t xml:space="preserve">        </w:t>
+      </w:r>
+      <w:r>
+        <w:rPr>
+          <w:rFonts w:ascii="JetBrains Mono" w:eastAsia="Times New Roman" w:hAnsi="JetBrains Mono" w:cs="Courier New"/>
+          <w:color w:val="ED864A"/>
+          <w:kern w:val="0"/>
+          <w:sz w:val="16"/>
+          <w:szCs w:val="16"/>
+          <w14:ligatures w14:val="none"/>
+        </w:rPr>
+        <w:t xml:space="preserve">if </w:t>
+      </w:r>
+      <w:proofErr w:type="spellStart"/>
+      <w:r>
+        <w:rPr>
+          <w:rFonts w:ascii="JetBrains Mono" w:eastAsia="Times New Roman" w:hAnsi="JetBrains Mono" w:cs="Courier New"/>
+          <w:color w:val="EBEBEB"/>
+          <w:kern w:val="0"/>
+          <w:sz w:val="16"/>
+          <w:szCs w:val="16"/>
+          <w14:ligatures w14:val="none"/>
+        </w:rPr>
+        <w:t>os.path.isdir</w:t>
+      </w:r>
+      <w:proofErr w:type="spellEnd"/>
+      <w:r>
+        <w:rPr>
+          <w:rFonts w:ascii="JetBrains Mono" w:eastAsia="Times New Roman" w:hAnsi="JetBrains Mono" w:cs="Courier New"/>
+          <w:color w:val="EBEBEB"/>
+          <w:kern w:val="0"/>
+          <w:sz w:val="16"/>
+          <w:szCs w:val="16"/>
+          <w14:ligatures w14:val="none"/>
+        </w:rPr>
+        <w:t>(repo):</w:t>
+      </w:r>
+      <w:r>
+        <w:rPr>
+          <w:rFonts w:ascii="JetBrains Mono" w:eastAsia="Times New Roman" w:hAnsi="JetBrains Mono" w:cs="Courier New"/>
+          <w:color w:val="EBEBEB"/>
+          <w:kern w:val="0"/>
+          <w:sz w:val="16"/>
+          <w:szCs w:val="16"/>
+          <w14:ligatures w14:val="none"/>
+        </w:rPr>
+        <w:br/>
+        <w:t xml:space="preserve">            </w:t>
+      </w:r>
+      <w:proofErr w:type="spellStart"/>
+      <w:r>
+        <w:rPr>
+          <w:rFonts w:ascii="JetBrains Mono" w:eastAsia="Times New Roman" w:hAnsi="JetBrains Mono" w:cs="Courier New"/>
+          <w:color w:val="EBEBEB"/>
+          <w:kern w:val="0"/>
+          <w:sz w:val="16"/>
+          <w:szCs w:val="16"/>
+          <w14:ligatures w14:val="none"/>
+        </w:rPr>
+        <w:t>update_repo</w:t>
+      </w:r>
+      <w:proofErr w:type="spellEnd"/>
+      <w:r>
+        <w:rPr>
+          <w:rFonts w:ascii="JetBrains Mono" w:eastAsia="Times New Roman" w:hAnsi="JetBrains Mono" w:cs="Courier New"/>
+          <w:color w:val="EBEBEB"/>
+          <w:kern w:val="0"/>
+          <w:sz w:val="16"/>
+          <w:szCs w:val="16"/>
+          <w14:ligatures w14:val="none"/>
+        </w:rPr>
+        <w:t>(repo)</w:t>
+      </w:r>
+      <w:r>
+        <w:rPr>
+          <w:rFonts w:ascii="JetBrains Mono" w:eastAsia="Times New Roman" w:hAnsi="JetBrains Mono" w:cs="Courier New"/>
+          <w:color w:val="EBEBEB"/>
+          <w:kern w:val="0"/>
+          <w:sz w:val="16"/>
+          <w:szCs w:val="16"/>
+          <w14:ligatures w14:val="none"/>
+        </w:rPr>
+        <w:br/>
+        <w:t xml:space="preserve">        </w:t>
+      </w:r>
+      <w:r>
+        <w:rPr>
+          <w:rFonts w:ascii="JetBrains Mono" w:eastAsia="Times New Roman" w:hAnsi="JetBrains Mono" w:cs="Courier New"/>
+          <w:color w:val="ED864A"/>
+          <w:kern w:val="0"/>
+          <w:sz w:val="16"/>
+          <w:szCs w:val="16"/>
+          <w14:ligatures w14:val="none"/>
+        </w:rPr>
+        <w:t>else</w:t>
+      </w:r>
+      <w:r>
+        <w:rPr>
+          <w:rFonts w:ascii="JetBrains Mono" w:eastAsia="Times New Roman" w:hAnsi="JetBrains Mono" w:cs="Courier New"/>
+          <w:color w:val="EBEBEB"/>
+          <w:kern w:val="0"/>
+          <w:sz w:val="16"/>
+          <w:szCs w:val="16"/>
+          <w14:ligatures w14:val="none"/>
+        </w:rPr>
+        <w:t>:</w:t>
+      </w:r>
+      <w:r>
+        <w:rPr>
+          <w:rFonts w:ascii="JetBrains Mono" w:eastAsia="Times New Roman" w:hAnsi="JetBrains Mono" w:cs="Courier New"/>
+          <w:color w:val="EBEBEB"/>
+          <w:kern w:val="0"/>
+          <w:sz w:val="16"/>
+          <w:szCs w:val="16"/>
+          <w14:ligatures w14:val="none"/>
+        </w:rPr>
+        <w:br/>
+        <w:t xml:space="preserve">            </w:t>
+      </w:r>
+      <w:r>
+        <w:rPr>
+          <w:rFonts w:ascii="JetBrains Mono" w:eastAsia="Times New Roman" w:hAnsi="JetBrains Mono" w:cs="Courier New"/>
+          <w:color w:val="8888C6"/>
+          <w:kern w:val="0"/>
+          <w:sz w:val="16"/>
+          <w:szCs w:val="16"/>
+          <w14:ligatures w14:val="none"/>
+        </w:rPr>
+        <w:t>print</w:t>
+      </w:r>
+      <w:r>
+        <w:rPr>
+          <w:rFonts w:ascii="JetBrains Mono" w:eastAsia="Times New Roman" w:hAnsi="JetBrains Mono" w:cs="Courier New"/>
+          <w:color w:val="EBEBEB"/>
+          <w:kern w:val="0"/>
+          <w:sz w:val="16"/>
+          <w:szCs w:val="16"/>
+          <w14:ligatures w14:val="none"/>
+        </w:rPr>
+        <w:t>(</w:t>
+      </w:r>
+      <w:proofErr w:type="spellStart"/>
+      <w:r>
+        <w:rPr>
+          <w:rFonts w:ascii="JetBrains Mono" w:eastAsia="Times New Roman" w:hAnsi="JetBrains Mono" w:cs="Courier New"/>
+          <w:color w:val="54B33E"/>
+          <w:kern w:val="0"/>
+          <w:sz w:val="16"/>
+          <w:szCs w:val="16"/>
+          <w14:ligatures w14:val="none"/>
+        </w:rPr>
+        <w:t>f"Directory</w:t>
+      </w:r>
+      <w:proofErr w:type="spellEnd"/>
+      <w:r>
+        <w:rPr>
+          <w:rFonts w:ascii="JetBrains Mono" w:eastAsia="Times New Roman" w:hAnsi="JetBrains Mono" w:cs="Courier New"/>
+          <w:color w:val="54B33E"/>
+          <w:kern w:val="0"/>
+          <w:sz w:val="16"/>
+          <w:szCs w:val="16"/>
+          <w14:ligatures w14:val="none"/>
+        </w:rPr>
+        <w:t xml:space="preserve"> not found: </w:t>
+      </w:r>
+      <w:r>
+        <w:rPr>
+          <w:rFonts w:ascii="JetBrains Mono" w:eastAsia="Times New Roman" w:hAnsi="JetBrains Mono" w:cs="Courier New"/>
+          <w:color w:val="ED864A"/>
+          <w:kern w:val="0"/>
+          <w:sz w:val="16"/>
+          <w:szCs w:val="16"/>
+          <w14:ligatures w14:val="none"/>
+        </w:rPr>
+        <w:t>{</w:t>
+      </w:r>
+      <w:r>
+        <w:rPr>
+          <w:rFonts w:ascii="JetBrains Mono" w:eastAsia="Times New Roman" w:hAnsi="JetBrains Mono" w:cs="Courier New"/>
+          <w:color w:val="EBEBEB"/>
+          <w:kern w:val="0"/>
+          <w:sz w:val="16"/>
+          <w:szCs w:val="16"/>
+          <w14:ligatures w14:val="none"/>
+        </w:rPr>
+        <w:t>repo</w:t>
+      </w:r>
+      <w:r>
+        <w:rPr>
+          <w:rFonts w:ascii="JetBrains Mono" w:eastAsia="Times New Roman" w:hAnsi="JetBrains Mono" w:cs="Courier New"/>
+          <w:color w:val="ED864A"/>
+          <w:kern w:val="0"/>
+          <w:sz w:val="16"/>
+          <w:szCs w:val="16"/>
+          <w14:ligatures w14:val="none"/>
+        </w:rPr>
+        <w:t>}</w:t>
+      </w:r>
+      <w:r>
+        <w:rPr>
+          <w:rFonts w:ascii="JetBrains Mono" w:eastAsia="Times New Roman" w:hAnsi="JetBrains Mono" w:cs="Courier New"/>
+          <w:color w:val="54B33E"/>
+          <w:kern w:val="0"/>
+          <w:sz w:val="16"/>
+          <w:szCs w:val="16"/>
+          <w14:ligatures w14:val="none"/>
+        </w:rPr>
+        <w:t>"</w:t>
+      </w:r>
+      <w:r>
+        <w:rPr>
+          <w:rFonts w:ascii="JetBrains Mono" w:eastAsia="Times New Roman" w:hAnsi="JetBrains Mono" w:cs="Courier New"/>
+          <w:color w:val="EBEBEB"/>
+          <w:kern w:val="0"/>
+          <w:sz w:val="16"/>
+          <w:szCs w:val="16"/>
+          <w14:ligatures w14:val="none"/>
+        </w:rPr>
+        <w:t>)</w:t>
+      </w:r>
+      <w:r>
+        <w:rPr>
+          <w:rFonts w:ascii="JetBrains Mono" w:eastAsia="Times New Roman" w:hAnsi="JetBrains Mono" w:cs="Courier New"/>
+          <w:color w:val="EBEBEB"/>
+          <w:kern w:val="0"/>
+          <w:sz w:val="16"/>
+          <w:szCs w:val="16"/>
+          <w14:ligatures w14:val="none"/>
+        </w:rPr>
+        <w:br/>
+      </w:r>
+      <w:r>
+        <w:rPr>
+          <w:rFonts w:ascii="JetBrains Mono" w:eastAsia="Times New Roman" w:hAnsi="JetBrains Mono" w:cs="Courier New"/>
+          <w:color w:val="EBEBEB"/>
+          <w:kern w:val="0"/>
+          <w:sz w:val="16"/>
+          <w:szCs w:val="16"/>
+          <w14:ligatures w14:val="none"/>
+        </w:rPr>
+        <w:br/>
+      </w:r>
+      <w:r>
+        <w:rPr>
+          <w:rFonts w:ascii="JetBrains Mono" w:eastAsia="Times New Roman" w:hAnsi="JetBrains Mono" w:cs="Courier New"/>
+          <w:color w:val="EBEBEB"/>
+          <w:kern w:val="0"/>
+          <w:sz w:val="16"/>
+          <w:szCs w:val="16"/>
+          <w14:ligatures w14:val="none"/>
+        </w:rPr>
+        <w:br/>
+      </w:r>
+      <w:r>
+        <w:rPr>
+          <w:rFonts w:ascii="JetBrains Mono" w:eastAsia="Times New Roman" w:hAnsi="JetBrains Mono" w:cs="Courier New"/>
+          <w:color w:val="ED864A"/>
+          <w:kern w:val="0"/>
+          <w:sz w:val="16"/>
+          <w:szCs w:val="16"/>
+          <w14:ligatures w14:val="none"/>
+        </w:rPr>
+        <w:t xml:space="preserve">if </w:t>
+      </w:r>
+      <w:r>
+        <w:rPr>
+          <w:rFonts w:ascii="JetBrains Mono" w:eastAsia="Times New Roman" w:hAnsi="JetBrains Mono" w:cs="Courier New"/>
+          <w:color w:val="EBEBEB"/>
+          <w:kern w:val="0"/>
+          <w:sz w:val="16"/>
+          <w:szCs w:val="16"/>
+          <w14:ligatures w14:val="none"/>
+        </w:rPr>
+        <w:t xml:space="preserve">__name__ == </w:t>
+      </w:r>
+      <w:r>
+        <w:rPr>
+          <w:rFonts w:ascii="JetBrains Mono" w:eastAsia="Times New Roman" w:hAnsi="JetBrains Mono" w:cs="Courier New"/>
+          <w:color w:val="54B33E"/>
+          <w:kern w:val="0"/>
+          <w:sz w:val="16"/>
+          <w:szCs w:val="16"/>
+          <w14:ligatures w14:val="none"/>
+        </w:rPr>
+        <w:t>"__main__"</w:t>
+      </w:r>
+      <w:r>
+        <w:rPr>
+          <w:rFonts w:ascii="JetBrains Mono" w:eastAsia="Times New Roman" w:hAnsi="JetBrains Mono" w:cs="Courier New"/>
+          <w:color w:val="EBEBEB"/>
+          <w:kern w:val="0"/>
+          <w:sz w:val="16"/>
+          <w:szCs w:val="16"/>
+          <w14:ligatures w14:val="none"/>
+        </w:rPr>
+        <w:t>:</w:t>
+      </w:r>
+      <w:r>
+        <w:rPr>
+          <w:rFonts w:ascii="JetBrains Mono" w:eastAsia="Times New Roman" w:hAnsi="JetBrains Mono" w:cs="Courier New"/>
+          <w:color w:val="EBEBEB"/>
+          <w:kern w:val="0"/>
+          <w:sz w:val="16"/>
+          <w:szCs w:val="16"/>
+          <w14:ligatures w14:val="none"/>
+        </w:rPr>
+        <w:br/>
+        <w:t xml:space="preserve">    main()</w:t>
+      </w:r>
+    </w:p>
+    <w:p/>
+    <w:p>
+      <w:pPr>
+        <w:rPr>
+          <w:rStyle w:val="Code-Consolas"/>
+          <w:rFonts w:asciiTheme="minorHAnsi" w:hAnsiTheme="minorHAnsi" w:cstheme="minorHAnsi"/>
+        </w:rPr>
       </w:pPr>
     </w:p>
     <w:sectPr>
-      <w:headerReference w:type="default" r:id="rId10"/>
-      <w:footerReference w:type="default" r:id="rId11"/>
+      <w:headerReference w:type="default" r:id="rId11"/>
+      <w:footerReference w:type="default" r:id="rId12"/>
       <w:pgSz w:w="12240" w:h="15840"/>
       <w:pgMar w:top="1440" w:right="1440" w:bottom="1440" w:left="1440" w:header="720" w:footer="720" w:gutter="0"/>
       <w:cols w:space="720"/>
@@ -8856,7 +12089,6 @@
   <w:style w:type="character" w:default="1" w:styleId="DefaultParagraphFont">
     <w:name w:val="Default Paragraph Font"/>
     <w:uiPriority w:val="1"/>
-    <w:semiHidden/>
     <w:unhideWhenUsed/>
   </w:style>
   <w:style w:type="table" w:default="1" w:styleId="TableNormal">

</xml_diff>